<commit_message>
Updated MS and model
</commit_message>
<xml_diff>
--- a/Manuscript/Manuscript.docx
+++ b/Manuscript/Manuscript.docx
@@ -1,11 +1,11 @@
 
 <file path=word/document.xml><?xml version="1.0" encoding="utf-8"?>
-<w:document xmlns:wpc="http://schemas.microsoft.com/office/word/2010/wordprocessingCanvas" xmlns:cx="http://schemas.microsoft.com/office/drawing/2014/chartex" xmlns:cx1="http://schemas.microsoft.com/office/drawing/2015/9/8/chartex" xmlns:cx2="http://schemas.microsoft.com/office/drawing/2015/10/21/chartex" xmlns:cx3="http://schemas.microsoft.com/office/drawing/2016/5/9/chartex" xmlns:cx4="http://schemas.microsoft.com/office/drawing/2016/5/10/chartex" xmlns:cx5="http://schemas.microsoft.com/office/drawing/2016/5/11/chartex" xmlns:cx6="http://schemas.microsoft.com/office/drawing/2016/5/12/chartex" xmlns:cx7="http://schemas.microsoft.com/office/drawing/2016/5/13/chartex" xmlns:cx8="http://schemas.microsoft.com/office/drawing/2016/5/14/chartex" xmlns:mc="http://schemas.openxmlformats.org/markup-compatibility/2006" xmlns:aink="http://schemas.microsoft.com/office/drawing/2016/ink" xmlns:am3d="http://schemas.microsoft.com/office/drawing/2017/model3d" xmlns:o="urn:schemas-microsoft-com:office:office" xmlns:oel="http://schemas.microsoft.com/office/2019/extlst" xmlns:r="http://schemas.openxmlformats.org/officeDocument/2006/relationships" xmlns:m="http://schemas.openxmlformats.org/officeDocument/2006/math" xmlns:v="urn:schemas-microsoft-com:vml" xmlns:wp14="http://schemas.microsoft.com/office/word/2010/wordprocessingDrawing" xmlns:wp="http://schemas.openxmlformats.org/drawingml/2006/wordprocessingDrawing" xmlns:w10="urn:schemas-microsoft-com:office:word" xmlns:w="http://schemas.openxmlformats.org/wordprocessingml/2006/main" xmlns:w14="http://schemas.microsoft.com/office/word/2010/wordml" xmlns:w15="http://schemas.microsoft.com/office/word/2012/wordml" xmlns:w16cex="http://schemas.microsoft.com/office/word/2018/wordml/cex" xmlns:w16cid="http://schemas.microsoft.com/office/word/2016/wordml/cid" xmlns:w16="http://schemas.microsoft.com/office/word/2018/wordml" xmlns:w16du="http://schemas.microsoft.com/office/word/2023/wordml/word16du" xmlns:w16sdtdh="http://schemas.microsoft.com/office/word/2020/wordml/sdtdatahash" xmlns:w16se="http://schemas.microsoft.com/office/word/2015/wordml/symex" xmlns:wpg="http://schemas.microsoft.com/office/word/2010/wordprocessingGroup" xmlns:wpi="http://schemas.microsoft.com/office/word/2010/wordprocessingInk" xmlns:wne="http://schemas.microsoft.com/office/word/2006/wordml" xmlns:wps="http://schemas.microsoft.com/office/word/2010/wordprocessingShape" mc:Ignorable="w14 w15 w16se w16cid w16 w16cex w16sdtdh w16du wp14">
+<w:document xmlns:wpc="http://schemas.microsoft.com/office/word/2010/wordprocessingCanvas" xmlns:cx="http://schemas.microsoft.com/office/drawing/2014/chartex" xmlns:cx1="http://schemas.microsoft.com/office/drawing/2015/9/8/chartex" xmlns:cx2="http://schemas.microsoft.com/office/drawing/2015/10/21/chartex" xmlns:cx3="http://schemas.microsoft.com/office/drawing/2016/5/9/chartex" xmlns:cx4="http://schemas.microsoft.com/office/drawing/2016/5/10/chartex" xmlns:cx5="http://schemas.microsoft.com/office/drawing/2016/5/11/chartex" xmlns:cx6="http://schemas.microsoft.com/office/drawing/2016/5/12/chartex" xmlns:cx7="http://schemas.microsoft.com/office/drawing/2016/5/13/chartex" xmlns:cx8="http://schemas.microsoft.com/office/drawing/2016/5/14/chartex" xmlns:mc="http://schemas.openxmlformats.org/markup-compatibility/2006" xmlns:aink="http://schemas.microsoft.com/office/drawing/2016/ink" xmlns:am3d="http://schemas.microsoft.com/office/drawing/2017/model3d" xmlns:o="urn:schemas-microsoft-com:office:office" xmlns:oel="http://schemas.microsoft.com/office/2019/extlst" xmlns:r="http://schemas.openxmlformats.org/officeDocument/2006/relationships" xmlns:m="http://schemas.openxmlformats.org/officeDocument/2006/math" xmlns:v="urn:schemas-microsoft-com:vml" xmlns:wp14="http://schemas.microsoft.com/office/word/2010/wordprocessingDrawing" xmlns:wp="http://schemas.openxmlformats.org/drawingml/2006/wordprocessingDrawing" xmlns:w10="urn:schemas-microsoft-com:office:word" xmlns:w="http://schemas.openxmlformats.org/wordprocessingml/2006/main" xmlns:w14="http://schemas.microsoft.com/office/word/2010/wordml" xmlns:w15="http://schemas.microsoft.com/office/word/2012/wordml" xmlns:w16cex="http://schemas.microsoft.com/office/word/2018/wordml/cex" xmlns:w16cid="http://schemas.microsoft.com/office/word/2016/wordml/cid" xmlns:w16="http://schemas.microsoft.com/office/word/2018/wordml" xmlns:w16du="http://schemas.microsoft.com/office/word/2023/wordml/word16du" xmlns:w16sdtdh="http://schemas.microsoft.com/office/word/2020/wordml/sdtdatahash" xmlns:w16sdtfl="http://schemas.microsoft.com/office/word/2024/wordml/sdtformatlock" xmlns:w16se="http://schemas.microsoft.com/office/word/2015/wordml/symex" xmlns:wpg="http://schemas.microsoft.com/office/word/2010/wordprocessingGroup" xmlns:wpi="http://schemas.microsoft.com/office/word/2010/wordprocessingInk" xmlns:wne="http://schemas.microsoft.com/office/word/2006/wordml" xmlns:wps="http://schemas.microsoft.com/office/word/2010/wordprocessingShape" mc:Ignorable="w14 w15 w16se w16cid w16 w16cex w16sdtdh w16sdtfl w16du wp14">
   <w:body>
     <w:p>
       <w:pPr>
         <w:rPr>
-          <w:rFonts w:ascii="Futura Medium" w:hAnsi="Futura Medium" w:cs="Futura Medium"/>
+          <w:rFonts w:ascii="Futura Medium" w:hAnsi="Futura Medium" w:cs="Futura Medium" w:hint="cs"/>
           <w:b/>
           <w:bCs/>
           <w:sz w:val="28"/>
@@ -20,13 +20,40 @@
           <w:sz w:val="28"/>
           <w:szCs w:val="28"/>
         </w:rPr>
-        <w:t>A mathematical model of macroalgal detrital dynamics</w:t>
+        <w:t xml:space="preserve">A model of macroalgal </w:t>
+      </w:r>
+      <w:r>
+        <w:rPr>
+          <w:rFonts w:ascii="Futura Medium" w:hAnsi="Futura Medium" w:cs="Futura Medium" w:hint="cs"/>
+          <w:b/>
+          <w:bCs/>
+          <w:sz w:val="28"/>
+          <w:szCs w:val="28"/>
+        </w:rPr>
+        <w:t>decomposition</w:t>
       </w:r>
     </w:p>
     <w:p>
       <w:pPr>
         <w:rPr>
           <w:rFonts w:ascii="Futura Medium" w:hAnsi="Futura Medium" w:cs="Futura Medium"/>
+          <w:b/>
+          <w:bCs/>
+        </w:rPr>
+      </w:pPr>
+      <w:r>
+        <w:rPr>
+          <w:rFonts w:ascii="Futura Medium" w:hAnsi="Futura Medium" w:cs="Futura Medium"/>
+          <w:b/>
+          <w:bCs/>
+        </w:rPr>
+        <w:t>Luka Seamus Wright</w:t>
+      </w:r>
+    </w:p>
+    <w:p>
+      <w:pPr>
+        <w:rPr>
+          <w:rFonts w:ascii="Futura Medium" w:hAnsi="Futura Medium" w:cs="Futura Medium" w:hint="cs"/>
           <w:b/>
           <w:bCs/>
         </w:rPr>
@@ -35,14 +62,14 @@
     <w:p>
       <w:pPr>
         <w:rPr>
-          <w:rFonts w:ascii="Futura Medium" w:hAnsi="Futura Medium" w:cs="Futura Medium"/>
+          <w:rFonts w:ascii="Futura Medium" w:hAnsi="Futura Medium" w:cs="Futura Medium" w:hint="cs"/>
           <w:b/>
           <w:bCs/>
         </w:rPr>
       </w:pPr>
       <w:r>
         <w:rPr>
-          <w:rFonts w:ascii="Futura Medium" w:hAnsi="Futura Medium" w:cs="Futura Medium"/>
+          <w:rFonts w:ascii="Futura Medium" w:hAnsi="Futura Medium" w:cs="Futura Medium" w:hint="cs"/>
           <w:b/>
           <w:bCs/>
         </w:rPr>
@@ -52,7 +79,7 @@
     <w:p>
       <w:pPr>
         <w:rPr>
-          <w:rFonts w:ascii="Futura Medium" w:hAnsi="Futura Medium" w:cs="Futura Medium"/>
+          <w:rFonts w:ascii="Futura Medium" w:hAnsi="Futura Medium" w:cs="Futura Medium" w:hint="cs"/>
           <w:b/>
           <w:bCs/>
         </w:rPr>
@@ -68,7 +95,7 @@
       </w:pPr>
       <w:r>
         <w:rPr>
-          <w:rFonts w:ascii="Futura Medium" w:hAnsi="Futura Medium" w:cs="Futura Medium"/>
+          <w:rFonts w:ascii="Futura Medium" w:hAnsi="Futura Medium" w:cs="Futura Medium" w:hint="cs"/>
           <w:b/>
           <w:bCs/>
         </w:rPr>
@@ -79,208 +106,113 @@
       <w:pPr>
         <w:rPr>
           <w:rFonts w:ascii="Futura Medium" w:hAnsi="Futura Medium" w:cs="Futura Medium"/>
-          <w:b/>
-          <w:bCs/>
         </w:rPr>
       </w:pPr>
       <w:r>
         <w:rPr>
           <w:rFonts w:ascii="Futura Medium" w:hAnsi="Futura Medium" w:cs="Futura Medium"/>
-          <w:b/>
-          <w:bCs/>
-        </w:rPr>
-        <w:t>{</w:t>
-      </w:r>
-      <w:proofErr w:type="spellStart"/>
-      <w:r>
-        <w:rPr>
-          <w:rFonts w:ascii="Futura Medium" w:hAnsi="Futura Medium" w:cs="Futura Medium"/>
-          <w:b/>
-          <w:bCs/>
-        </w:rPr>
-        <w:t>Pessarrodona</w:t>
-      </w:r>
-      <w:proofErr w:type="spellEnd"/>
-      <w:r>
-        <w:rPr>
-          <w:rFonts w:ascii="Futura Medium" w:hAnsi="Futura Medium" w:cs="Futura Medium"/>
-          <w:b/>
-          <w:bCs/>
-        </w:rPr>
-        <w:t xml:space="preserve"> et al., 2023, #24778}</w:t>
+        </w:rPr>
+        <w:t xml:space="preserve">In a seminal paper published in this journal 62 years ago, </w:t>
+      </w:r>
+      <w:r>
+        <w:rPr>
+          <w:rFonts w:ascii="Futura Medium" w:hAnsi="Futura Medium" w:cs="Futura Medium"/>
+        </w:rPr>
+        <w:t>{Olson, 1963, #2327}</w:t>
+      </w:r>
+      <w:r>
+        <w:rPr>
+          <w:rFonts w:ascii="Futura Medium" w:hAnsi="Futura Medium" w:cs="Futura Medium"/>
+        </w:rPr>
+        <w:t xml:space="preserve"> popularised the </w:t>
+      </w:r>
+      <w:r>
+        <w:rPr>
+          <w:rFonts w:ascii="Futura Medium" w:hAnsi="Futura Medium" w:cs="Futura Medium"/>
+        </w:rPr>
+        <w:t>ordinary differential equation</w:t>
+      </w:r>
+      <w:r>
+        <w:rPr>
+          <w:rFonts w:ascii="Futura Medium" w:hAnsi="Futura Medium" w:cs="Futura Medium"/>
+        </w:rPr>
+        <w:t xml:space="preserve"> of leaf litter decomposition</w:t>
       </w:r>
     </w:p>
     <w:p>
       <w:pPr>
         <w:rPr>
           <w:rFonts w:ascii="Futura Medium" w:hAnsi="Futura Medium" w:cs="Futura Medium"/>
-          <w:b/>
-          <w:bCs/>
-        </w:rPr>
-      </w:pPr>
-      <w:r>
-        <w:rPr>
-          <w:rFonts w:ascii="Futura Medium" w:hAnsi="Futura Medium" w:cs="Futura Medium"/>
-          <w:b/>
-          <w:bCs/>
-        </w:rPr>
-        <w:t>{Birch et al., 1983, #5320}</w:t>
-      </w:r>
-    </w:p>
-    <w:p>
-      <w:pPr>
-        <w:rPr>
-          <w:rFonts w:ascii="Futura Medium" w:hAnsi="Futura Medium" w:cs="Futura Medium"/>
-          <w:b/>
-          <w:bCs/>
-        </w:rPr>
-      </w:pPr>
-      <w:r>
-        <w:rPr>
-          <w:rFonts w:ascii="Futura Medium" w:hAnsi="Futura Medium" w:cs="Futura Medium"/>
-          <w:b/>
-          <w:bCs/>
-        </w:rPr>
-        <w:t>{Albright et al., 1982, #85687}</w:t>
-      </w:r>
-    </w:p>
-    <w:p>
-      <w:pPr>
-        <w:rPr>
-          <w:rFonts w:ascii="Futura Medium" w:hAnsi="Futura Medium" w:cs="Futura Medium"/>
-          <w:b/>
-          <w:bCs/>
-        </w:rPr>
-      </w:pPr>
-      <w:r>
-        <w:rPr>
-          <w:rFonts w:ascii="Futura Medium" w:hAnsi="Futura Medium" w:cs="Futura Medium"/>
-          <w:b/>
-          <w:bCs/>
-        </w:rPr>
-        <w:t>{Smith and Foreman, 1984, #41137}</w:t>
-      </w:r>
-    </w:p>
-    <w:p>
-      <w:pPr>
-        <w:rPr>
-          <w:rFonts w:ascii="Futura Medium" w:hAnsi="Futura Medium" w:cs="Futura Medium"/>
-          <w:b/>
-          <w:bCs/>
-        </w:rPr>
-      </w:pPr>
-      <w:r>
-        <w:rPr>
-          <w:rFonts w:ascii="Futura Medium" w:hAnsi="Futura Medium" w:cs="Futura Medium"/>
-          <w:b/>
-          <w:bCs/>
-        </w:rPr>
-        <w:t>{Brouwer, 1996, #26704}</w:t>
-      </w:r>
-    </w:p>
-    <w:p>
-      <w:pPr>
-        <w:rPr>
-          <w:rFonts w:ascii="Futura Medium" w:hAnsi="Futura Medium" w:cs="Futura Medium"/>
-          <w:b/>
-          <w:bCs/>
-        </w:rPr>
-      </w:pPr>
-      <w:r>
-        <w:rPr>
-          <w:rFonts w:ascii="Futura Medium" w:hAnsi="Futura Medium" w:cs="Futura Medium"/>
-          <w:b/>
-          <w:bCs/>
-        </w:rPr>
-        <w:t>{</w:t>
-      </w:r>
-      <w:proofErr w:type="spellStart"/>
-      <w:r>
-        <w:rPr>
-          <w:rFonts w:ascii="Futura Medium" w:hAnsi="Futura Medium" w:cs="Futura Medium"/>
-          <w:b/>
-          <w:bCs/>
-        </w:rPr>
-        <w:t>Bourguès</w:t>
-      </w:r>
-      <w:proofErr w:type="spellEnd"/>
-      <w:r>
-        <w:rPr>
-          <w:rFonts w:ascii="Futura Medium" w:hAnsi="Futura Medium" w:cs="Futura Medium"/>
-          <w:b/>
-          <w:bCs/>
-        </w:rPr>
-        <w:t xml:space="preserve"> et al., 1996, #24868}</w:t>
-      </w:r>
-    </w:p>
-    <w:p>
-      <w:pPr>
-        <w:rPr>
-          <w:rFonts w:ascii="Futura Medium" w:hAnsi="Futura Medium" w:cs="Futura Medium"/>
-          <w:b/>
-          <w:bCs/>
         </w:rPr>
       </w:pPr>
     </w:p>
     <w:p>
       <w:pPr>
-        <w:rPr>
-          <w:rFonts w:ascii="Futura Medium" w:hAnsi="Futura Medium" w:cs="Futura Medium"/>
-          <w:b/>
-          <w:bCs/>
+        <w:tabs>
+          <w:tab w:val="right" w:pos="9026"/>
+        </w:tabs>
+        <w:rPr>
+          <w:rFonts w:ascii="Futura Medium" w:hAnsi="Futura Medium" w:cs="Futura Medium" w:hint="cs"/>
         </w:rPr>
       </w:pPr>
-      <w:r>
-        <w:rPr>
-          <w:rFonts w:ascii="Futura Medium" w:hAnsi="Futura Medium" w:cs="Futura Medium"/>
-          <w:b/>
-          <w:bCs/>
-        </w:rPr>
-        <w:t>{</w:t>
-      </w:r>
-      <w:proofErr w:type="spellStart"/>
-      <w:r>
-        <w:rPr>
-          <w:rFonts w:ascii="Futura Medium" w:hAnsi="Futura Medium" w:cs="Futura Medium"/>
-          <w:b/>
-          <w:bCs/>
-        </w:rPr>
-        <w:t>Rovira</w:t>
-      </w:r>
-      <w:proofErr w:type="spellEnd"/>
-      <w:r>
-        <w:rPr>
-          <w:rFonts w:ascii="Futura Medium" w:hAnsi="Futura Medium" w:cs="Futura Medium"/>
-          <w:b/>
-          <w:bCs/>
-        </w:rPr>
-        <w:t xml:space="preserve"> and </w:t>
-      </w:r>
-      <w:proofErr w:type="spellStart"/>
-      <w:r>
-        <w:rPr>
-          <w:rFonts w:ascii="Futura Medium" w:hAnsi="Futura Medium" w:cs="Futura Medium"/>
-          <w:b/>
-          <w:bCs/>
-        </w:rPr>
-        <w:t>Rovira</w:t>
-      </w:r>
-      <w:proofErr w:type="spellEnd"/>
-      <w:r>
-        <w:rPr>
-          <w:rFonts w:ascii="Futura Medium" w:hAnsi="Futura Medium" w:cs="Futura Medium"/>
-          <w:b/>
-          <w:bCs/>
-        </w:rPr>
-        <w:t>, 2010, #106773}</w:t>
+      <m:oMath>
+        <m:f>
+          <m:fPr>
+            <m:ctrlPr>
+              <w:rPr>
+                <w:rFonts w:ascii="Cambria Math" w:hAnsi="Cambria Math" w:cs="Futura Medium" w:hint="cs"/>
+                <w:i/>
+              </w:rPr>
+            </m:ctrlPr>
+          </m:fPr>
+          <m:num>
+            <m:r>
+              <w:rPr>
+                <w:rFonts w:ascii="Cambria Math" w:hAnsi="Cambria Math" w:cs="Futura Medium" w:hint="cs"/>
+              </w:rPr>
+              <m:t>dm</m:t>
+            </m:r>
+          </m:num>
+          <m:den>
+            <m:r>
+              <w:rPr>
+                <w:rFonts w:ascii="Cambria Math" w:hAnsi="Cambria Math" w:cs="Futura Medium" w:hint="cs"/>
+              </w:rPr>
+              <m:t>dt</m:t>
+            </m:r>
+          </m:den>
+        </m:f>
+        <m:r>
+          <w:rPr>
+            <w:rFonts w:ascii="Cambria Math" w:hAnsi="Cambria Math" w:cs="Futura Medium" w:hint="cs"/>
+          </w:rPr>
+          <m:t>=-km</m:t>
+        </m:r>
+      </m:oMath>
+      <w:r>
+        <w:rPr>
+          <w:rFonts w:ascii="Futura Medium" w:eastAsiaTheme="minorEastAsia" w:hAnsi="Futura Medium" w:cs="Futura Medium" w:hint="cs"/>
+        </w:rPr>
+        <w:tab/>
+        <w:t>(</w:t>
+      </w:r>
+      <w:r>
+        <w:rPr>
+          <w:rFonts w:ascii="Futura Medium" w:eastAsiaTheme="minorEastAsia" w:hAnsi="Futura Medium" w:cs="Futura Medium" w:hint="cs"/>
+        </w:rPr>
+        <w:t>1</w:t>
+      </w:r>
+      <w:r>
+        <w:rPr>
+          <w:rFonts w:ascii="Futura Medium" w:eastAsiaTheme="minorEastAsia" w:hAnsi="Futura Medium" w:cs="Futura Medium" w:hint="cs"/>
+        </w:rPr>
+        <w:t>)</w:t>
       </w:r>
     </w:p>
     <w:p>
       <w:pPr>
         <w:rPr>
           <w:rFonts w:ascii="Futura Medium" w:hAnsi="Futura Medium" w:cs="Futura Medium"/>
-          <w:b/>
-          <w:bCs/>
         </w:rPr>
       </w:pPr>
     </w:p>
@@ -288,155 +220,244 @@
       <w:pPr>
         <w:rPr>
           <w:rFonts w:ascii="Futura Medium" w:hAnsi="Futura Medium" w:cs="Futura Medium"/>
-          <w:b/>
-          <w:bCs/>
         </w:rPr>
       </w:pPr>
       <w:r>
         <w:rPr>
           <w:rFonts w:ascii="Futura Medium" w:hAnsi="Futura Medium" w:cs="Futura Medium"/>
-          <w:b/>
-          <w:bCs/>
-        </w:rPr>
-        <w:t>{</w:t>
-      </w:r>
-      <w:proofErr w:type="spellStart"/>
-      <w:r>
-        <w:rPr>
-          <w:rFonts w:ascii="Futura Medium" w:hAnsi="Futura Medium" w:cs="Futura Medium"/>
-          <w:b/>
-          <w:bCs/>
-        </w:rPr>
-        <w:t>Trevathan</w:t>
-      </w:r>
-      <w:proofErr w:type="spellEnd"/>
-      <w:r>
-        <w:rPr>
-          <w:rFonts w:ascii="Futura Medium" w:hAnsi="Futura Medium" w:cs="Futura Medium"/>
-          <w:b/>
-          <w:bCs/>
-        </w:rPr>
-        <w:t>-Tackett et al., 2020, #39238}</w:t>
+        </w:rPr>
+        <w:t xml:space="preserve">which describes the rate of change in litter mass </w:t>
+      </w:r>
+      <w:r>
+        <w:rPr>
+          <w:rFonts w:ascii="Futura Medium" w:hAnsi="Futura Medium" w:cs="Futura Medium"/>
+          <w:i/>
+          <w:iCs/>
+        </w:rPr>
+        <w:t>m</w:t>
+      </w:r>
+      <w:r>
+        <w:rPr>
+          <w:rFonts w:ascii="Futura Medium" w:hAnsi="Futura Medium" w:cs="Futura Medium"/>
+        </w:rPr>
+        <w:t xml:space="preserve"> proportional to itself</w:t>
+      </w:r>
+      <w:r>
+        <w:rPr>
+          <w:rFonts w:ascii="Futura Medium" w:hAnsi="Futura Medium" w:cs="Futura Medium"/>
+        </w:rPr>
+        <w:t xml:space="preserve">, </w:t>
+      </w:r>
+      <w:r>
+        <w:rPr>
+          <w:rFonts w:ascii="Futura Medium" w:hAnsi="Futura Medium" w:cs="Futura Medium"/>
+        </w:rPr>
+        <w:t xml:space="preserve">a relationship which is </w:t>
+      </w:r>
+      <w:r>
+        <w:rPr>
+          <w:rFonts w:ascii="Futura Medium" w:hAnsi="Futura Medium" w:cs="Futura Medium"/>
+        </w:rPr>
+        <w:t>parameterised by the</w:t>
+      </w:r>
+      <w:r>
+        <w:rPr>
+          <w:rFonts w:ascii="Futura Medium" w:hAnsi="Futura Medium" w:cs="Futura Medium"/>
+        </w:rPr>
+        <w:t xml:space="preserve"> decay constant </w:t>
+      </w:r>
+      <w:r>
+        <w:rPr>
+          <w:rFonts w:ascii="Futura Medium" w:hAnsi="Futura Medium" w:cs="Futura Medium"/>
+          <w:i/>
+          <w:iCs/>
+        </w:rPr>
+        <w:t>k</w:t>
+      </w:r>
+      <w:r>
+        <w:rPr>
+          <w:rFonts w:ascii="Futura Medium" w:hAnsi="Futura Medium" w:cs="Futura Medium"/>
+        </w:rPr>
+        <w:t xml:space="preserve">. </w:t>
+      </w:r>
+      <w:r>
+        <w:rPr>
+          <w:rFonts w:ascii="Futura Medium" w:hAnsi="Futura Medium" w:cs="Futura Medium"/>
+        </w:rPr>
+        <w:t xml:space="preserve">This reflects our ecological understanding that </w:t>
+      </w:r>
+      <w:r>
+        <w:rPr>
+          <w:rFonts w:ascii="Futura Medium" w:hAnsi="Futura Medium" w:cs="Futura Medium"/>
+        </w:rPr>
+        <w:t xml:space="preserve">given a theoretically limitless pool of decomposers, decomposition is </w:t>
+      </w:r>
+      <w:r>
+        <w:rPr>
+          <w:rFonts w:ascii="Futura Medium" w:hAnsi="Futura Medium" w:cs="Futura Medium"/>
+        </w:rPr>
+        <w:t>proportional to</w:t>
+      </w:r>
+      <w:r>
+        <w:rPr>
+          <w:rFonts w:ascii="Futura Medium" w:hAnsi="Futura Medium" w:cs="Futura Medium"/>
+        </w:rPr>
+        <w:t xml:space="preserve"> the </w:t>
+      </w:r>
+      <w:r>
+        <w:rPr>
+          <w:rFonts w:ascii="Futura Medium" w:hAnsi="Futura Medium" w:cs="Futura Medium"/>
+        </w:rPr>
+        <w:t xml:space="preserve">detrital </w:t>
+      </w:r>
+      <w:r>
+        <w:rPr>
+          <w:rFonts w:ascii="Futura Medium" w:hAnsi="Futura Medium" w:cs="Futura Medium"/>
+        </w:rPr>
+        <w:t xml:space="preserve">pool. </w:t>
+      </w:r>
+      <w:r>
+        <w:rPr>
+          <w:rFonts w:ascii="Futura Medium" w:hAnsi="Futura Medium" w:cs="Futura Medium"/>
+        </w:rPr>
+        <w:t>Th</w:t>
+      </w:r>
+      <w:r>
+        <w:rPr>
+          <w:rFonts w:ascii="Futura Medium" w:hAnsi="Futura Medium" w:cs="Futura Medium"/>
+        </w:rPr>
+        <w:t>e</w:t>
+      </w:r>
+      <w:r>
+        <w:rPr>
+          <w:rFonts w:ascii="Futura Medium" w:hAnsi="Futura Medium" w:cs="Futura Medium"/>
+        </w:rPr>
+        <w:t xml:space="preserve"> equation integrates to</w:t>
       </w:r>
     </w:p>
     <w:p>
       <w:pPr>
         <w:rPr>
           <w:rFonts w:ascii="Futura Medium" w:hAnsi="Futura Medium" w:cs="Futura Medium"/>
-          <w:b/>
-          <w:bCs/>
-        </w:rPr>
-      </w:pPr>
-      <w:r>
-        <w:rPr>
-          <w:rFonts w:ascii="Futura Medium" w:hAnsi="Futura Medium" w:cs="Futura Medium"/>
-          <w:b/>
-          <w:bCs/>
-        </w:rPr>
-        <w:t xml:space="preserve">{de </w:t>
-      </w:r>
-      <w:proofErr w:type="spellStart"/>
-      <w:r>
-        <w:rPr>
-          <w:rFonts w:ascii="Futura Medium" w:hAnsi="Futura Medium" w:cs="Futura Medium"/>
-          <w:b/>
-          <w:bCs/>
-        </w:rPr>
-        <w:t>Bettignies</w:t>
-      </w:r>
-      <w:proofErr w:type="spellEnd"/>
-      <w:r>
-        <w:rPr>
-          <w:rFonts w:ascii="Futura Medium" w:hAnsi="Futura Medium" w:cs="Futura Medium"/>
-          <w:b/>
-          <w:bCs/>
-        </w:rPr>
-        <w:t xml:space="preserve"> et al., 2020, #27484}</w:t>
-      </w:r>
-    </w:p>
-    <w:p>
-      <w:pPr>
-        <w:rPr>
-          <w:rFonts w:ascii="Futura Medium" w:hAnsi="Futura Medium" w:cs="Futura Medium"/>
-          <w:b/>
-          <w:bCs/>
-        </w:rPr>
-      </w:pPr>
-      <w:r>
-        <w:rPr>
-          <w:rFonts w:ascii="Futura Medium" w:hAnsi="Futura Medium" w:cs="Futura Medium"/>
-          <w:b/>
-          <w:bCs/>
-        </w:rPr>
-        <w:t>{Hamersley et al., 2015, #100187}</w:t>
-      </w:r>
-    </w:p>
-    <w:p>
-      <w:pPr>
-        <w:rPr>
-          <w:rFonts w:ascii="Futura Medium" w:hAnsi="Futura Medium" w:cs="Futura Medium"/>
-          <w:b/>
-          <w:bCs/>
-        </w:rPr>
-      </w:pPr>
-      <w:r>
-        <w:rPr>
-          <w:rFonts w:ascii="Futura Medium" w:hAnsi="Futura Medium" w:cs="Futura Medium"/>
-          <w:b/>
-          <w:bCs/>
-        </w:rPr>
-        <w:t>{Pedersen et al., 2021, #86830}</w:t>
-      </w:r>
-    </w:p>
-    <w:p>
-      <w:pPr>
-        <w:rPr>
-          <w:rFonts w:ascii="Futura Medium" w:hAnsi="Futura Medium" w:cs="Futura Medium"/>
-          <w:b/>
-          <w:bCs/>
-        </w:rPr>
-      </w:pPr>
-      <w:r>
-        <w:rPr>
-          <w:rFonts w:ascii="Futura Medium" w:hAnsi="Futura Medium" w:cs="Futura Medium"/>
-          <w:b/>
-          <w:bCs/>
-        </w:rPr>
-        <w:t>{Frontier et al., 2021, #5573}</w:t>
-      </w:r>
-    </w:p>
-    <w:p>
-      <w:pPr>
-        <w:rPr>
-          <w:rFonts w:ascii="Futura Medium" w:hAnsi="Futura Medium" w:cs="Futura Medium"/>
-          <w:b/>
-          <w:bCs/>
         </w:rPr>
       </w:pPr>
     </w:p>
     <w:p>
       <w:pPr>
-        <w:rPr>
-          <w:rFonts w:ascii="Futura Medium" w:hAnsi="Futura Medium" w:cs="Futura Medium"/>
-          <w:b/>
-          <w:bCs/>
+        <w:tabs>
+          <w:tab w:val="right" w:pos="9026"/>
+        </w:tabs>
+        <w:rPr>
+          <w:rFonts w:ascii="Futura Medium" w:hAnsi="Futura Medium" w:cs="Futura Medium" w:hint="cs"/>
         </w:rPr>
       </w:pPr>
-      <w:r>
-        <w:rPr>
-          <w:rFonts w:ascii="Futura Medium" w:hAnsi="Futura Medium" w:cs="Futura Medium"/>
-          <w:b/>
-          <w:bCs/>
-        </w:rPr>
-        <w:t>{Frontier et al., 2021, #81382}</w:t>
+      <m:oMath>
+        <m:r>
+          <m:rPr>
+            <m:sty m:val="p"/>
+          </m:rPr>
+          <w:rPr>
+            <w:rFonts w:ascii="Cambria Math" w:hAnsi="Cambria Math" w:cs="Futura Medium"/>
+          </w:rPr>
+          <m:t>ln</m:t>
+        </m:r>
+        <m:f>
+          <m:fPr>
+            <m:ctrlPr>
+              <w:rPr>
+                <w:rFonts w:ascii="Cambria Math" w:hAnsi="Cambria Math" w:cs="Futura Medium"/>
+                <w:i/>
+              </w:rPr>
+            </m:ctrlPr>
+          </m:fPr>
+          <m:num>
+            <m:sSub>
+              <m:sSubPr>
+                <m:ctrlPr>
+                  <w:rPr>
+                    <w:rFonts w:ascii="Cambria Math" w:hAnsi="Cambria Math" w:cs="Futura Medium"/>
+                    <w:i/>
+                  </w:rPr>
+                </m:ctrlPr>
+              </m:sSubPr>
+              <m:e>
+                <m:r>
+                  <w:rPr>
+                    <w:rFonts w:ascii="Cambria Math" w:hAnsi="Cambria Math" w:cs="Futura Medium"/>
+                  </w:rPr>
+                  <m:t>m</m:t>
+                </m:r>
+              </m:e>
+              <m:sub>
+                <m:r>
+                  <w:rPr>
+                    <w:rFonts w:ascii="Cambria Math" w:hAnsi="Cambria Math" w:cs="Futura Medium"/>
+                  </w:rPr>
+                  <m:t>t</m:t>
+                </m:r>
+              </m:sub>
+            </m:sSub>
+          </m:num>
+          <m:den>
+            <m:sSub>
+              <m:sSubPr>
+                <m:ctrlPr>
+                  <w:rPr>
+                    <w:rFonts w:ascii="Cambria Math" w:hAnsi="Cambria Math" w:cs="Futura Medium"/>
+                    <w:i/>
+                  </w:rPr>
+                </m:ctrlPr>
+              </m:sSubPr>
+              <m:e>
+                <m:r>
+                  <w:rPr>
+                    <w:rFonts w:ascii="Cambria Math" w:hAnsi="Cambria Math" w:cs="Futura Medium"/>
+                  </w:rPr>
+                  <m:t>m</m:t>
+                </m:r>
+              </m:e>
+              <m:sub>
+                <m:r>
+                  <w:rPr>
+                    <w:rFonts w:ascii="Cambria Math" w:hAnsi="Cambria Math" w:cs="Futura Medium"/>
+                  </w:rPr>
+                  <m:t>0</m:t>
+                </m:r>
+              </m:sub>
+            </m:sSub>
+          </m:den>
+        </m:f>
+        <m:r>
+          <w:rPr>
+            <w:rFonts w:ascii="Cambria Math" w:hAnsi="Cambria Math" w:cs="Futura Medium"/>
+          </w:rPr>
+          <m:t>=-kt</m:t>
+        </m:r>
+      </m:oMath>
+      <w:r>
+        <w:rPr>
+          <w:rFonts w:ascii="Futura Medium" w:eastAsiaTheme="minorEastAsia" w:hAnsi="Futura Medium" w:cs="Futura Medium" w:hint="cs"/>
+        </w:rPr>
+        <w:tab/>
+        <w:t>(</w:t>
+      </w:r>
+      <w:r>
+        <w:rPr>
+          <w:rFonts w:ascii="Futura Medium" w:eastAsiaTheme="minorEastAsia" w:hAnsi="Futura Medium" w:cs="Futura Medium"/>
+        </w:rPr>
+        <w:t>2</w:t>
+      </w:r>
+      <w:r>
+        <w:rPr>
+          <w:rFonts w:ascii="Futura Medium" w:eastAsiaTheme="minorEastAsia" w:hAnsi="Futura Medium" w:cs="Futura Medium" w:hint="cs"/>
+        </w:rPr>
+        <w:t>)</w:t>
       </w:r>
     </w:p>
     <w:p>
       <w:pPr>
         <w:rPr>
-          <w:rFonts w:ascii="Futura Medium" w:hAnsi="Futura Medium" w:cs="Futura Medium"/>
-          <w:b/>
-          <w:bCs/>
+          <w:rFonts w:ascii="Futura Medium" w:eastAsiaTheme="minorEastAsia" w:hAnsi="Futura Medium" w:cs="Futura Medium"/>
         </w:rPr>
       </w:pPr>
     </w:p>
@@ -444,69 +465,158 @@
       <w:pPr>
         <w:rPr>
           <w:rFonts w:ascii="Futura Medium" w:hAnsi="Futura Medium" w:cs="Futura Medium"/>
-          <w:b/>
-          <w:bCs/>
         </w:rPr>
       </w:pPr>
       <w:r>
         <w:rPr>
           <w:rFonts w:ascii="Futura Medium" w:hAnsi="Futura Medium" w:cs="Futura Medium"/>
-          <w:b/>
-          <w:bCs/>
-        </w:rPr>
-        <w:t>{Wright et al., 2023, #11375}</w:t>
+        </w:rPr>
+        <w:t>and</w:t>
+      </w:r>
+      <w:r>
+        <w:rPr>
+          <w:rFonts w:ascii="Futura Medium" w:hAnsi="Futura Medium" w:cs="Futura Medium"/>
+        </w:rPr>
+        <w:t xml:space="preserve"> simplifies to the familiar </w:t>
+      </w:r>
+      <w:r>
+        <w:rPr>
+          <w:rFonts w:ascii="Futura Medium" w:hAnsi="Futura Medium" w:cs="Futura Medium"/>
+        </w:rPr>
+        <w:t xml:space="preserve">exponential decay </w:t>
+      </w:r>
+      <w:r>
+        <w:rPr>
+          <w:rFonts w:ascii="Futura Medium" w:hAnsi="Futura Medium" w:cs="Futura Medium"/>
+        </w:rPr>
+        <w:t>function</w:t>
       </w:r>
     </w:p>
     <w:p>
       <w:pPr>
         <w:rPr>
-          <w:rFonts w:ascii="Futura Medium" w:hAnsi="Futura Medium" w:cs="Futura Medium"/>
-          <w:b/>
-          <w:bCs/>
+          <w:rFonts w:ascii="Futura Medium" w:eastAsiaTheme="minorEastAsia" w:hAnsi="Futura Medium" w:cs="Futura Medium"/>
         </w:rPr>
       </w:pPr>
     </w:p>
     <w:p>
       <w:pPr>
-        <w:rPr>
-          <w:rFonts w:ascii="Futura Medium" w:hAnsi="Futura Medium" w:cs="Futura Medium"/>
-          <w:b/>
-          <w:bCs/>
+        <w:tabs>
+          <w:tab w:val="right" w:pos="9026"/>
+        </w:tabs>
+        <w:rPr>
+          <w:rFonts w:ascii="Futura Medium" w:hAnsi="Futura Medium" w:cs="Futura Medium" w:hint="cs"/>
         </w:rPr>
       </w:pPr>
-      <w:r>
-        <w:rPr>
-          <w:rFonts w:ascii="Futura Medium" w:hAnsi="Futura Medium" w:cs="Futura Medium"/>
-          <w:b/>
-          <w:bCs/>
-        </w:rPr>
-        <w:t xml:space="preserve">{Wright and </w:t>
-      </w:r>
-      <w:proofErr w:type="spellStart"/>
-      <w:r>
-        <w:rPr>
-          <w:rFonts w:ascii="Futura Medium" w:hAnsi="Futura Medium" w:cs="Futura Medium"/>
-          <w:b/>
-          <w:bCs/>
-        </w:rPr>
-        <w:t>Kregting</w:t>
-      </w:r>
-      <w:proofErr w:type="spellEnd"/>
-      <w:r>
-        <w:rPr>
-          <w:rFonts w:ascii="Futura Medium" w:hAnsi="Futura Medium" w:cs="Futura Medium"/>
-          <w:b/>
-          <w:bCs/>
-        </w:rPr>
-        <w:t>, 2023, #49344}</w:t>
+      <m:oMath>
+        <m:sSub>
+          <m:sSubPr>
+            <m:ctrlPr>
+              <w:rPr>
+                <w:rFonts w:ascii="Cambria Math" w:hAnsi="Cambria Math" w:cs="Futura Medium"/>
+              </w:rPr>
+            </m:ctrlPr>
+          </m:sSubPr>
+          <m:e>
+            <m:r>
+              <w:rPr>
+                <w:rFonts w:ascii="Cambria Math" w:hAnsi="Cambria Math" w:cs="Futura Medium"/>
+              </w:rPr>
+              <m:t>m</m:t>
+            </m:r>
+          </m:e>
+          <m:sub>
+            <m:r>
+              <w:rPr>
+                <w:rFonts w:ascii="Cambria Math" w:hAnsi="Cambria Math" w:cs="Futura Medium"/>
+              </w:rPr>
+              <m:t>t</m:t>
+            </m:r>
+          </m:sub>
+        </m:sSub>
+        <m:r>
+          <w:rPr>
+            <w:rFonts w:ascii="Cambria Math" w:hAnsi="Cambria Math" w:cs="Futura Medium"/>
+          </w:rPr>
+          <m:t>=</m:t>
+        </m:r>
+        <m:sSup>
+          <m:sSupPr>
+            <m:ctrlPr>
+              <w:rPr>
+                <w:rFonts w:ascii="Cambria Math" w:hAnsi="Cambria Math" w:cs="Futura Medium"/>
+                <w:i/>
+              </w:rPr>
+            </m:ctrlPr>
+          </m:sSupPr>
+          <m:e>
+            <m:sSub>
+              <m:sSubPr>
+                <m:ctrlPr>
+                  <w:rPr>
+                    <w:rFonts w:ascii="Cambria Math" w:hAnsi="Cambria Math" w:cs="Futura Medium"/>
+                    <w:i/>
+                  </w:rPr>
+                </m:ctrlPr>
+              </m:sSubPr>
+              <m:e>
+                <m:r>
+                  <w:rPr>
+                    <w:rFonts w:ascii="Cambria Math" w:hAnsi="Cambria Math" w:cs="Futura Medium"/>
+                  </w:rPr>
+                  <m:t>m</m:t>
+                </m:r>
+              </m:e>
+              <m:sub>
+                <m:r>
+                  <w:rPr>
+                    <w:rFonts w:ascii="Cambria Math" w:hAnsi="Cambria Math" w:cs="Futura Medium"/>
+                  </w:rPr>
+                  <m:t>0</m:t>
+                </m:r>
+              </m:sub>
+            </m:sSub>
+            <m:r>
+              <w:rPr>
+                <w:rFonts w:ascii="Cambria Math" w:hAnsi="Cambria Math" w:cs="Futura Medium"/>
+              </w:rPr>
+              <m:t>e</m:t>
+            </m:r>
+          </m:e>
+          <m:sup>
+            <m:r>
+              <w:rPr>
+                <w:rFonts w:ascii="Cambria Math" w:hAnsi="Cambria Math" w:cs="Futura Medium"/>
+              </w:rPr>
+              <m:t>-kt</m:t>
+            </m:r>
+          </m:sup>
+        </m:sSup>
+      </m:oMath>
+      <w:r>
+        <w:rPr>
+          <w:rFonts w:ascii="Futura Medium" w:eastAsiaTheme="minorEastAsia" w:hAnsi="Futura Medium" w:cs="Futura Medium" w:hint="cs"/>
+        </w:rPr>
+        <w:tab/>
+        <w:t>(</w:t>
+      </w:r>
+      <w:r>
+        <w:rPr>
+          <w:rFonts w:ascii="Futura Medium" w:eastAsiaTheme="minorEastAsia" w:hAnsi="Futura Medium" w:cs="Futura Medium"/>
+        </w:rPr>
+        <w:t>3</w:t>
+      </w:r>
+      <w:r>
+        <w:rPr>
+          <w:rFonts w:ascii="Futura Medium" w:eastAsiaTheme="minorEastAsia" w:hAnsi="Futura Medium" w:cs="Futura Medium" w:hint="cs"/>
+        </w:rPr>
+        <w:t>)</w:t>
       </w:r>
     </w:p>
     <w:p>
       <w:pPr>
         <w:rPr>
           <w:rFonts w:ascii="Futura Medium" w:hAnsi="Futura Medium" w:cs="Futura Medium"/>
-          <w:b/>
-          <w:bCs/>
         </w:rPr>
       </w:pPr>
     </w:p>
@@ -514,43 +624,107 @@
       <w:pPr>
         <w:rPr>
           <w:rFonts w:ascii="Futura Medium" w:hAnsi="Futura Medium" w:cs="Futura Medium"/>
-          <w:b/>
-          <w:bCs/>
         </w:rPr>
       </w:pPr>
       <w:r>
         <w:rPr>
           <w:rFonts w:ascii="Futura Medium" w:hAnsi="Futura Medium" w:cs="Futura Medium"/>
-          <w:b/>
-          <w:bCs/>
-        </w:rPr>
-        <w:t xml:space="preserve">{Wright and </w:t>
+        </w:rPr>
+        <w:t xml:space="preserve">where </w:t>
       </w:r>
       <w:proofErr w:type="spellStart"/>
       <w:r>
         <w:rPr>
           <w:rFonts w:ascii="Futura Medium" w:hAnsi="Futura Medium" w:cs="Futura Medium"/>
-          <w:b/>
-          <w:bCs/>
-        </w:rPr>
-        <w:t>Foggo</w:t>
+          <w:i/>
+          <w:iCs/>
+        </w:rPr>
+        <w:t>m</w:t>
+      </w:r>
+      <w:r>
+        <w:rPr>
+          <w:rFonts w:ascii="Futura Medium" w:hAnsi="Futura Medium" w:cs="Futura Medium"/>
+          <w:i/>
+          <w:iCs/>
+          <w:vertAlign w:val="subscript"/>
+        </w:rPr>
+        <w:t>t</w:t>
       </w:r>
       <w:proofErr w:type="spellEnd"/>
       <w:r>
         <w:rPr>
           <w:rFonts w:ascii="Futura Medium" w:hAnsi="Futura Medium" w:cs="Futura Medium"/>
-          <w:b/>
-          <w:bCs/>
-        </w:rPr>
-        <w:t>, 2021, #58012}</w:t>
+        </w:rPr>
+        <w:t xml:space="preserve"> </w:t>
+      </w:r>
+      <w:r>
+        <w:rPr>
+          <w:rFonts w:ascii="Futura Medium" w:hAnsi="Futura Medium" w:cs="Futura Medium"/>
+        </w:rPr>
+        <w:t xml:space="preserve">and </w:t>
+      </w:r>
+      <w:r>
+        <w:rPr>
+          <w:rFonts w:ascii="Futura Medium" w:hAnsi="Futura Medium" w:cs="Futura Medium"/>
+          <w:i/>
+          <w:iCs/>
+        </w:rPr>
+        <w:t>m</w:t>
+      </w:r>
+      <w:r>
+        <w:rPr>
+          <w:rFonts w:ascii="Futura Medium" w:hAnsi="Futura Medium" w:cs="Futura Medium"/>
+          <w:i/>
+          <w:iCs/>
+          <w:vertAlign w:val="subscript"/>
+        </w:rPr>
+        <w:t>0</w:t>
+      </w:r>
+      <w:r>
+        <w:rPr>
+          <w:rFonts w:ascii="Futura Medium" w:hAnsi="Futura Medium" w:cs="Futura Medium"/>
+        </w:rPr>
+        <w:t xml:space="preserve"> are the litter masses at time </w:t>
+      </w:r>
+      <w:r>
+        <w:rPr>
+          <w:rFonts w:ascii="Futura Medium" w:hAnsi="Futura Medium" w:cs="Futura Medium"/>
+          <w:i/>
+          <w:iCs/>
+        </w:rPr>
+        <w:t>t</w:t>
+      </w:r>
+      <w:r>
+        <w:rPr>
+          <w:rFonts w:ascii="Futura Medium" w:hAnsi="Futura Medium" w:cs="Futura Medium"/>
+        </w:rPr>
+        <w:t xml:space="preserve"> and </w:t>
+      </w:r>
+      <w:r>
+        <w:rPr>
+          <w:rFonts w:ascii="Futura Medium" w:hAnsi="Futura Medium" w:cs="Futura Medium"/>
+          <w:i/>
+          <w:iCs/>
+        </w:rPr>
+        <w:t>t</w:t>
+      </w:r>
+      <w:r>
+        <w:rPr>
+          <w:rFonts w:ascii="Futura Medium" w:hAnsi="Futura Medium" w:cs="Futura Medium"/>
+        </w:rPr>
+        <w:t xml:space="preserve"> = 0.</w:t>
+      </w:r>
+      <w:r>
+        <w:rPr>
+          <w:rFonts w:ascii="Futura Medium" w:hAnsi="Futura Medium" w:cs="Futura Medium"/>
+        </w:rPr>
+        <w:t xml:space="preserve"> This function has prevailed as the model of choice for decomposition.</w:t>
       </w:r>
     </w:p>
     <w:p>
       <w:pPr>
         <w:rPr>
           <w:rFonts w:ascii="Futura Medium" w:hAnsi="Futura Medium" w:cs="Futura Medium"/>
-          <w:b/>
-          <w:bCs/>
         </w:rPr>
       </w:pPr>
     </w:p>
@@ -558,25 +732,614 @@
       <w:pPr>
         <w:rPr>
           <w:rFonts w:ascii="Futura Medium" w:hAnsi="Futura Medium" w:cs="Futura Medium"/>
-          <w:b/>
-          <w:bCs/>
         </w:rPr>
       </w:pPr>
       <w:r>
         <w:rPr>
           <w:rFonts w:ascii="Futura Medium" w:hAnsi="Futura Medium" w:cs="Futura Medium"/>
-          <w:b/>
-          <w:bCs/>
-        </w:rPr>
-        <w:t>{Wright et al., 2022, #84780}</w:t>
+        </w:rPr>
+        <w:t>I</w:t>
+      </w:r>
+      <w:r>
+        <w:rPr>
+          <w:rFonts w:ascii="Futura Medium" w:hAnsi="Futura Medium" w:cs="Futura Medium"/>
+        </w:rPr>
+        <w:t xml:space="preserve">nterest </w:t>
+      </w:r>
+      <w:r>
+        <w:rPr>
+          <w:rFonts w:ascii="Futura Medium" w:hAnsi="Futura Medium" w:cs="Futura Medium"/>
+        </w:rPr>
+        <w:t>in decomposition has been rekindled due to the hope that plants can mitigate anthropogenic climate change by fixing carbon dioxide</w:t>
+      </w:r>
+      <w:r>
+        <w:rPr>
+          <w:rFonts w:ascii="Futura Medium" w:hAnsi="Futura Medium" w:cs="Futura Medium"/>
+        </w:rPr>
+        <w:t xml:space="preserve"> (CO</w:t>
+      </w:r>
+      <w:r>
+        <w:rPr>
+          <w:rFonts w:ascii="Futura Medium" w:hAnsi="Futura Medium" w:cs="Futura Medium"/>
+          <w:vertAlign w:val="subscript"/>
+        </w:rPr>
+        <w:t>2</w:t>
+      </w:r>
+      <w:r>
+        <w:rPr>
+          <w:rFonts w:ascii="Futura Medium" w:hAnsi="Futura Medium" w:cs="Futura Medium"/>
+        </w:rPr>
+        <w:t>)</w:t>
+      </w:r>
+      <w:r>
+        <w:rPr>
+          <w:rFonts w:ascii="Futura Medium" w:hAnsi="Futura Medium" w:cs="Futura Medium"/>
+        </w:rPr>
+        <w:t>, assimilating it into their tissues, and sequestering it in their biomass</w:t>
+      </w:r>
+      <w:r>
+        <w:rPr>
+          <w:rFonts w:ascii="Futura Medium" w:hAnsi="Futura Medium" w:cs="Futura Medium"/>
+        </w:rPr>
+        <w:t xml:space="preserve">. </w:t>
+      </w:r>
+      <w:r>
+        <w:rPr>
+          <w:rFonts w:ascii="Futura Medium" w:hAnsi="Futura Medium" w:cs="Futura Medium"/>
+        </w:rPr>
+        <w:t>Carbon s</w:t>
+      </w:r>
+      <w:r>
+        <w:rPr>
+          <w:rFonts w:ascii="Futura Medium" w:hAnsi="Futura Medium" w:cs="Futura Medium"/>
+        </w:rPr>
+        <w:t xml:space="preserve">equestration </w:t>
+      </w:r>
+      <w:r>
+        <w:rPr>
+          <w:rFonts w:ascii="Futura Medium" w:hAnsi="Futura Medium" w:cs="Futura Medium"/>
+        </w:rPr>
+        <w:t>timescales</w:t>
+      </w:r>
+      <w:r>
+        <w:rPr>
+          <w:rFonts w:ascii="Futura Medium" w:hAnsi="Futura Medium" w:cs="Futura Medium"/>
+        </w:rPr>
+        <w:t xml:space="preserve"> of </w:t>
+      </w:r>
+      <w:r>
+        <w:rPr>
+          <w:rFonts w:ascii="Futura Medium" w:hAnsi="Futura Medium" w:cs="Futura Medium"/>
+        </w:rPr>
+        <w:t xml:space="preserve">decades to centuries </w:t>
+      </w:r>
+      <w:r>
+        <w:rPr>
+          <w:rFonts w:ascii="Futura Medium" w:hAnsi="Futura Medium" w:cs="Futura Medium"/>
+        </w:rPr>
+        <w:t xml:space="preserve">are </w:t>
+      </w:r>
+      <w:r>
+        <w:rPr>
+          <w:rFonts w:ascii="Futura Medium" w:hAnsi="Futura Medium" w:cs="Futura Medium"/>
+        </w:rPr>
+        <w:t>being considered the minimum</w:t>
+      </w:r>
+      <w:r>
+        <w:rPr>
+          <w:rFonts w:ascii="Futura Medium" w:hAnsi="Futura Medium" w:cs="Futura Medium"/>
+        </w:rPr>
+        <w:t xml:space="preserve"> and ten millennia or longer are preferred</w:t>
+      </w:r>
+      <w:r>
+        <w:rPr>
+          <w:rFonts w:ascii="Futura Medium" w:hAnsi="Futura Medium" w:cs="Futura Medium"/>
+        </w:rPr>
+        <w:t xml:space="preserve"> </w:t>
+      </w:r>
+      <w:r>
+        <w:rPr>
+          <w:rFonts w:ascii="Futura Medium" w:hAnsi="Futura Medium" w:cs="Futura Medium"/>
+        </w:rPr>
+        <w:t>{IPCC, 2022, #30410}</w:t>
+      </w:r>
+      <w:r>
+        <w:rPr>
+          <w:rFonts w:ascii="Futura Medium" w:hAnsi="Futura Medium" w:cs="Futura Medium"/>
+        </w:rPr>
+        <w:t>.</w:t>
+      </w:r>
+      <w:r>
+        <w:rPr>
+          <w:rFonts w:ascii="Futura Medium" w:hAnsi="Futura Medium" w:cs="Futura Medium"/>
+        </w:rPr>
+        <w:t xml:space="preserve"> </w:t>
+      </w:r>
+      <w:r>
+        <w:rPr>
+          <w:rFonts w:ascii="Futura Medium" w:hAnsi="Futura Medium" w:cs="Futura Medium"/>
+        </w:rPr>
+        <w:t xml:space="preserve">Plant biomass can be split into two distinct </w:t>
+      </w:r>
+      <w:r>
+        <w:rPr>
+          <w:rFonts w:ascii="Futura Medium" w:hAnsi="Futura Medium" w:cs="Futura Medium"/>
+        </w:rPr>
+        <w:t>carbon sinks</w:t>
+      </w:r>
+      <w:r>
+        <w:rPr>
+          <w:rFonts w:ascii="Futura Medium" w:hAnsi="Futura Medium" w:cs="Futura Medium"/>
+        </w:rPr>
+        <w:t>: living plants</w:t>
+      </w:r>
+      <w:r>
+        <w:rPr>
+          <w:rFonts w:ascii="Futura Medium" w:hAnsi="Futura Medium" w:cs="Futura Medium"/>
+        </w:rPr>
+        <w:t xml:space="preserve"> and the detrital pool</w:t>
+      </w:r>
+      <w:r>
+        <w:rPr>
+          <w:rFonts w:ascii="Futura Medium" w:hAnsi="Futura Medium" w:cs="Futura Medium"/>
+        </w:rPr>
+        <w:t xml:space="preserve">, of which the latter </w:t>
+      </w:r>
+      <w:r>
+        <w:rPr>
+          <w:rFonts w:ascii="Futura Medium" w:hAnsi="Futura Medium" w:cs="Futura Medium"/>
+        </w:rPr>
+        <w:t xml:space="preserve">is considered the </w:t>
+      </w:r>
+      <w:r>
+        <w:rPr>
+          <w:rFonts w:ascii="Futura Medium" w:hAnsi="Futura Medium" w:cs="Futura Medium"/>
+        </w:rPr>
+        <w:t>more</w:t>
+      </w:r>
+      <w:r>
+        <w:rPr>
+          <w:rFonts w:ascii="Futura Medium" w:hAnsi="Futura Medium" w:cs="Futura Medium"/>
+        </w:rPr>
+        <w:t xml:space="preserve"> promising</w:t>
+      </w:r>
+      <w:r>
+        <w:rPr>
+          <w:rFonts w:ascii="Futura Medium" w:hAnsi="Futura Medium" w:cs="Futura Medium"/>
+        </w:rPr>
+        <w:t xml:space="preserve">. </w:t>
+      </w:r>
+      <w:r>
+        <w:rPr>
+          <w:rFonts w:ascii="Futura Medium" w:hAnsi="Futura Medium" w:cs="Futura Medium"/>
+        </w:rPr>
+        <w:t>Often surprising to botanists and ecologists, plant d</w:t>
+      </w:r>
+      <w:r>
+        <w:rPr>
+          <w:rFonts w:ascii="Futura Medium" w:hAnsi="Futura Medium" w:cs="Futura Medium"/>
+        </w:rPr>
+        <w:t>etritus</w:t>
+      </w:r>
+      <w:r>
+        <w:rPr>
+          <w:rFonts w:ascii="Futura Medium" w:hAnsi="Futura Medium" w:cs="Futura Medium"/>
+        </w:rPr>
+        <w:t xml:space="preserve"> </w:t>
+      </w:r>
+      <w:r>
+        <w:rPr>
+          <w:rFonts w:ascii="Futura Medium" w:hAnsi="Futura Medium" w:cs="Futura Medium"/>
+        </w:rPr>
+        <w:t xml:space="preserve">amounts to a biomass that is </w:t>
+      </w:r>
+      <w:r>
+        <w:rPr>
+          <w:rFonts w:ascii="Futura Medium" w:hAnsi="Futura Medium" w:cs="Futura Medium"/>
+        </w:rPr>
+        <w:t xml:space="preserve">generally </w:t>
+      </w:r>
+      <w:r>
+        <w:rPr>
+          <w:rFonts w:ascii="Futura Medium" w:hAnsi="Futura Medium" w:cs="Futura Medium"/>
+        </w:rPr>
+        <w:t xml:space="preserve">comparable </w:t>
+      </w:r>
+      <w:r>
+        <w:rPr>
+          <w:rFonts w:ascii="Futura Medium" w:hAnsi="Futura Medium" w:cs="Futura Medium"/>
+        </w:rPr>
+        <w:t xml:space="preserve">and </w:t>
+      </w:r>
+      <w:r>
+        <w:rPr>
+          <w:rFonts w:ascii="Futura Medium" w:hAnsi="Futura Medium" w:cs="Futura Medium"/>
+        </w:rPr>
+        <w:t>often</w:t>
+      </w:r>
+      <w:r>
+        <w:rPr>
+          <w:rFonts w:ascii="Futura Medium" w:hAnsi="Futura Medium" w:cs="Futura Medium"/>
+        </w:rPr>
+        <w:t xml:space="preserve"> </w:t>
+      </w:r>
+      <w:r>
+        <w:rPr>
+          <w:rFonts w:ascii="Futura Medium" w:hAnsi="Futura Medium" w:cs="Futura Medium"/>
+        </w:rPr>
+        <w:t xml:space="preserve">far </w:t>
+      </w:r>
+      <w:r>
+        <w:rPr>
+          <w:rFonts w:ascii="Futura Medium" w:hAnsi="Futura Medium" w:cs="Futura Medium"/>
+        </w:rPr>
+        <w:t xml:space="preserve">greater than that of living plants </w:t>
+      </w:r>
+      <w:r>
+        <w:rPr>
+          <w:rFonts w:ascii="Futura Medium" w:hAnsi="Futura Medium" w:cs="Futura Medium"/>
+        </w:rPr>
+        <w:t>{Cebrián and Duarte, 1995, #98069}</w:t>
+      </w:r>
+      <w:r>
+        <w:t xml:space="preserve"> </w:t>
+      </w:r>
+      <w:r>
+        <w:rPr>
+          <w:rFonts w:ascii="Futura Medium" w:hAnsi="Futura Medium" w:cs="Futura Medium"/>
+        </w:rPr>
+        <w:t xml:space="preserve">{Wright and </w:t>
+      </w:r>
+      <w:proofErr w:type="spellStart"/>
+      <w:r>
+        <w:rPr>
+          <w:rFonts w:ascii="Futura Medium" w:hAnsi="Futura Medium" w:cs="Futura Medium"/>
+        </w:rPr>
+        <w:t>Kregting</w:t>
+      </w:r>
+      <w:proofErr w:type="spellEnd"/>
+      <w:r>
+        <w:rPr>
+          <w:rFonts w:ascii="Futura Medium" w:hAnsi="Futura Medium" w:cs="Futura Medium"/>
+        </w:rPr>
+        <w:t>, 2023, #49343}</w:t>
+      </w:r>
+      <w:r>
+        <w:rPr>
+          <w:rFonts w:ascii="Futura Medium" w:hAnsi="Futura Medium" w:cs="Futura Medium"/>
+        </w:rPr>
+        <w:t xml:space="preserve">. </w:t>
+      </w:r>
+      <w:r>
+        <w:rPr>
+          <w:rFonts w:ascii="Futura Medium" w:hAnsi="Futura Medium" w:cs="Futura Medium"/>
+        </w:rPr>
+        <w:t>But more importantly</w:t>
+      </w:r>
+      <w:r>
+        <w:rPr>
+          <w:rFonts w:ascii="Futura Medium" w:hAnsi="Futura Medium" w:cs="Futura Medium"/>
+        </w:rPr>
+        <w:t>,</w:t>
+      </w:r>
+      <w:r>
+        <w:rPr>
+          <w:rFonts w:ascii="Futura Medium" w:hAnsi="Futura Medium" w:cs="Futura Medium"/>
+        </w:rPr>
+        <w:t xml:space="preserve"> living plants, </w:t>
+      </w:r>
+      <w:r>
+        <w:rPr>
+          <w:rFonts w:ascii="Futura Medium" w:hAnsi="Futura Medium" w:cs="Futura Medium"/>
+        </w:rPr>
+        <w:t xml:space="preserve">even when considering stable </w:t>
+      </w:r>
+      <w:r>
+        <w:rPr>
+          <w:rFonts w:ascii="Futura Medium" w:hAnsi="Futura Medium" w:cs="Futura Medium"/>
+        </w:rPr>
+        <w:t xml:space="preserve">or increasing </w:t>
+      </w:r>
+      <w:r>
+        <w:rPr>
+          <w:rFonts w:ascii="Futura Medium" w:hAnsi="Futura Medium" w:cs="Futura Medium"/>
+        </w:rPr>
+        <w:t>populations</w:t>
+      </w:r>
+      <w:r>
+        <w:rPr>
+          <w:rFonts w:ascii="Futura Medium" w:hAnsi="Futura Medium" w:cs="Futura Medium"/>
+        </w:rPr>
+        <w:t>,</w:t>
+      </w:r>
+      <w:r>
+        <w:rPr>
+          <w:rFonts w:ascii="Futura Medium" w:hAnsi="Futura Medium" w:cs="Futura Medium"/>
+        </w:rPr>
+        <w:t xml:space="preserve"> </w:t>
+      </w:r>
+      <w:r>
+        <w:rPr>
+          <w:rFonts w:ascii="Futura Medium" w:hAnsi="Futura Medium" w:cs="Futura Medium"/>
+        </w:rPr>
+        <w:t xml:space="preserve">are limited </w:t>
+      </w:r>
+      <w:r>
+        <w:rPr>
+          <w:rFonts w:ascii="Futura Medium" w:hAnsi="Futura Medium" w:cs="Futura Medium"/>
+        </w:rPr>
+        <w:t xml:space="preserve">by </w:t>
+      </w:r>
+      <w:r>
+        <w:rPr>
+          <w:rFonts w:ascii="Futura Medium" w:hAnsi="Futura Medium" w:cs="Futura Medium"/>
+        </w:rPr>
+        <w:t>biomass</w:t>
+      </w:r>
+      <w:r>
+        <w:rPr>
+          <w:rFonts w:ascii="Futura Medium" w:hAnsi="Futura Medium" w:cs="Futura Medium"/>
+        </w:rPr>
+        <w:t>-density constraints</w:t>
+      </w:r>
+      <w:r>
+        <w:rPr>
+          <w:rFonts w:ascii="Futura Medium" w:hAnsi="Futura Medium" w:cs="Futura Medium"/>
+        </w:rPr>
+        <w:t xml:space="preserve"> </w:t>
+      </w:r>
+      <w:r>
+        <w:rPr>
+          <w:rFonts w:ascii="Futura Medium" w:hAnsi="Futura Medium" w:cs="Futura Medium"/>
+        </w:rPr>
+        <w:t>{Creed et al., 2019, #70680}</w:t>
+      </w:r>
+      <w:r>
+        <w:rPr>
+          <w:rFonts w:ascii="Futura Medium" w:hAnsi="Futura Medium" w:cs="Futura Medium"/>
+        </w:rPr>
+        <w:t xml:space="preserve"> </w:t>
+      </w:r>
+      <w:r>
+        <w:rPr>
+          <w:rFonts w:ascii="Futura Medium" w:hAnsi="Futura Medium" w:cs="Futura Medium"/>
+        </w:rPr>
+        <w:t xml:space="preserve">and </w:t>
+      </w:r>
+      <w:r>
+        <w:rPr>
+          <w:rFonts w:ascii="Futura Medium" w:hAnsi="Futura Medium" w:cs="Futura Medium"/>
+        </w:rPr>
+        <w:t xml:space="preserve">lifespans of </w:t>
+      </w:r>
+      <w:r>
+        <w:rPr>
+          <w:rFonts w:ascii="Futura Medium" w:hAnsi="Futura Medium" w:cs="Futura Medium"/>
+        </w:rPr>
+        <w:t xml:space="preserve">typically </w:t>
+      </w:r>
+      <w:r>
+        <w:rPr>
+          <w:rFonts w:ascii="Futura Medium" w:hAnsi="Futura Medium" w:cs="Futura Medium"/>
+        </w:rPr>
+        <w:t xml:space="preserve">less than a millennium </w:t>
+      </w:r>
+      <w:r>
+        <w:rPr>
+          <w:rFonts w:ascii="Futura Medium" w:hAnsi="Futura Medium" w:cs="Futura Medium"/>
+        </w:rPr>
+        <w:t>{Thomas, 2013, #50506}</w:t>
+      </w:r>
+      <w:r>
+        <w:rPr>
+          <w:rFonts w:ascii="Futura Medium" w:hAnsi="Futura Medium" w:cs="Futura Medium"/>
+        </w:rPr>
+        <w:t>.</w:t>
+      </w:r>
+      <w:r>
+        <w:rPr>
+          <w:rFonts w:ascii="Futura Medium" w:hAnsi="Futura Medium" w:cs="Futura Medium"/>
+        </w:rPr>
+        <w:t xml:space="preserve"> </w:t>
+      </w:r>
+      <w:r>
+        <w:rPr>
+          <w:rFonts w:ascii="Futura Medium" w:hAnsi="Futura Medium" w:cs="Futura Medium"/>
+        </w:rPr>
+        <w:t>D</w:t>
+      </w:r>
+      <w:r>
+        <w:rPr>
+          <w:rFonts w:ascii="Futura Medium" w:hAnsi="Futura Medium" w:cs="Futura Medium"/>
+        </w:rPr>
+        <w:t>etritus</w:t>
+      </w:r>
+      <w:r>
+        <w:rPr>
+          <w:rFonts w:ascii="Futura Medium" w:hAnsi="Futura Medium" w:cs="Futura Medium"/>
+        </w:rPr>
+        <w:t xml:space="preserve"> </w:t>
+      </w:r>
+      <w:r>
+        <w:rPr>
+          <w:rFonts w:ascii="Futura Medium" w:hAnsi="Futura Medium" w:cs="Futura Medium"/>
+        </w:rPr>
+        <w:t xml:space="preserve">on the other hand </w:t>
+      </w:r>
+      <w:r>
+        <w:rPr>
+          <w:rFonts w:ascii="Futura Medium" w:hAnsi="Futura Medium" w:cs="Futura Medium"/>
+        </w:rPr>
+        <w:t xml:space="preserve">is believed to have the potential of </w:t>
+      </w:r>
+      <w:r>
+        <w:rPr>
+          <w:rFonts w:ascii="Futura Medium" w:hAnsi="Futura Medium" w:cs="Futura Medium"/>
+        </w:rPr>
+        <w:t xml:space="preserve">cumulative </w:t>
+      </w:r>
+      <w:r>
+        <w:rPr>
+          <w:rFonts w:ascii="Futura Medium" w:hAnsi="Futura Medium" w:cs="Futura Medium"/>
+        </w:rPr>
+        <w:t xml:space="preserve">sequestration </w:t>
+      </w:r>
+      <w:r>
+        <w:rPr>
+          <w:rFonts w:ascii="Futura Medium" w:hAnsi="Futura Medium" w:cs="Futura Medium"/>
+        </w:rPr>
+        <w:t xml:space="preserve">over </w:t>
+      </w:r>
+      <w:r>
+        <w:rPr>
+          <w:rFonts w:ascii="Futura Medium" w:hAnsi="Futura Medium" w:cs="Futura Medium"/>
+        </w:rPr>
+        <w:t xml:space="preserve">much longer timescales. </w:t>
+      </w:r>
+      <w:r>
+        <w:rPr>
+          <w:rFonts w:ascii="Futura Medium" w:hAnsi="Futura Medium" w:cs="Futura Medium"/>
+        </w:rPr>
+        <w:t>F</w:t>
+      </w:r>
+      <w:r>
+        <w:rPr>
+          <w:rFonts w:ascii="Futura Medium" w:hAnsi="Futura Medium" w:cs="Futura Medium"/>
+        </w:rPr>
+        <w:t xml:space="preserve">ossil fuels were created via the </w:t>
+      </w:r>
+      <w:r>
+        <w:rPr>
+          <w:rFonts w:ascii="Futura Medium" w:hAnsi="Futura Medium" w:cs="Futura Medium"/>
+        </w:rPr>
+        <w:t>detrital pathway</w:t>
+      </w:r>
+      <w:r>
+        <w:rPr>
+          <w:rFonts w:ascii="Futura Medium" w:hAnsi="Futura Medium" w:cs="Futura Medium"/>
+        </w:rPr>
+        <w:t xml:space="preserve"> </w:t>
+      </w:r>
+      <w:r>
+        <w:rPr>
+          <w:rFonts w:ascii="Futura Medium" w:hAnsi="Futura Medium" w:cs="Futura Medium"/>
+        </w:rPr>
+        <w:t xml:space="preserve">of </w:t>
+      </w:r>
+      <w:r>
+        <w:rPr>
+          <w:rFonts w:ascii="Futura Medium" w:hAnsi="Futura Medium" w:cs="Futura Medium"/>
+        </w:rPr>
+        <w:t xml:space="preserve">scale trees </w:t>
+      </w:r>
+      <w:r>
+        <w:rPr>
+          <w:rFonts w:ascii="Futura Medium" w:hAnsi="Futura Medium" w:cs="Futura Medium"/>
+        </w:rPr>
+        <w:t xml:space="preserve">and other land plants </w:t>
+      </w:r>
+      <w:r>
+        <w:rPr>
+          <w:rFonts w:ascii="Futura Medium" w:hAnsi="Futura Medium" w:cs="Futura Medium"/>
+        </w:rPr>
+        <w:t xml:space="preserve">in the </w:t>
+      </w:r>
+      <w:r>
+        <w:rPr>
+          <w:rFonts w:ascii="Futura Medium" w:hAnsi="Futura Medium" w:cs="Futura Medium"/>
+        </w:rPr>
+        <w:t>C</w:t>
+      </w:r>
+      <w:r>
+        <w:rPr>
+          <w:rFonts w:ascii="Futura Medium" w:hAnsi="Futura Medium" w:cs="Futura Medium"/>
+        </w:rPr>
+        <w:t>arboniferous</w:t>
+      </w:r>
+      <w:r>
+        <w:rPr>
+          <w:rFonts w:ascii="Futura Medium" w:hAnsi="Futura Medium" w:cs="Futura Medium"/>
+        </w:rPr>
+        <w:t xml:space="preserve"> </w:t>
+      </w:r>
+      <w:r>
+        <w:rPr>
+          <w:rFonts w:ascii="Futura Medium" w:hAnsi="Futura Medium" w:cs="Futura Medium"/>
+        </w:rPr>
+        <w:t>{Hibbett et al., 2016, #52060}</w:t>
+      </w:r>
+      <w:r>
+        <w:rPr>
+          <w:rFonts w:ascii="Futura Medium" w:hAnsi="Futura Medium" w:cs="Futura Medium"/>
+        </w:rPr>
+        <w:t xml:space="preserve"> and t</w:t>
+      </w:r>
+      <w:r>
+        <w:rPr>
+          <w:rFonts w:ascii="Futura Medium" w:hAnsi="Futura Medium" w:cs="Futura Medium"/>
+        </w:rPr>
+        <w:t>he</w:t>
+      </w:r>
+      <w:r>
+        <w:rPr>
+          <w:rFonts w:ascii="Futura Medium" w:hAnsi="Futura Medium" w:cs="Futura Medium"/>
+        </w:rPr>
+        <w:t xml:space="preserve"> hope of </w:t>
+      </w:r>
+      <w:r>
+        <w:rPr>
+          <w:rFonts w:ascii="Futura Medium" w:hAnsi="Futura Medium" w:cs="Futura Medium"/>
+        </w:rPr>
+        <w:t xml:space="preserve">biological </w:t>
+      </w:r>
+      <w:r>
+        <w:rPr>
+          <w:rFonts w:ascii="Futura Medium" w:hAnsi="Futura Medium" w:cs="Futura Medium"/>
+        </w:rPr>
+        <w:t>CO</w:t>
+      </w:r>
+      <w:r>
+        <w:rPr>
+          <w:rFonts w:ascii="Futura Medium" w:hAnsi="Futura Medium" w:cs="Futura Medium"/>
+          <w:vertAlign w:val="subscript"/>
+        </w:rPr>
+        <w:t>2</w:t>
+      </w:r>
+      <w:r>
+        <w:rPr>
+          <w:rFonts w:ascii="Futura Medium" w:hAnsi="Futura Medium" w:cs="Futura Medium"/>
+        </w:rPr>
+        <w:t xml:space="preserve"> </w:t>
+      </w:r>
+      <w:r>
+        <w:rPr>
+          <w:rFonts w:ascii="Futura Medium" w:hAnsi="Futura Medium" w:cs="Futura Medium"/>
+        </w:rPr>
+        <w:t>removal</w:t>
+      </w:r>
+      <w:r>
+        <w:rPr>
+          <w:rFonts w:ascii="Futura Medium" w:hAnsi="Futura Medium" w:cs="Futura Medium"/>
+        </w:rPr>
+        <w:t xml:space="preserve"> essentially boils down to re-enacting </w:t>
+      </w:r>
+      <w:r>
+        <w:rPr>
+          <w:rFonts w:ascii="Futura Medium" w:hAnsi="Futura Medium" w:cs="Futura Medium"/>
+        </w:rPr>
+        <w:t>fossil fuel generation</w:t>
+      </w:r>
+      <w:r>
+        <w:rPr>
+          <w:rFonts w:ascii="Futura Medium" w:hAnsi="Futura Medium" w:cs="Futura Medium"/>
+        </w:rPr>
+        <w:t>.</w:t>
       </w:r>
     </w:p>
     <w:p>
       <w:pPr>
         <w:rPr>
           <w:rFonts w:ascii="Futura Medium" w:hAnsi="Futura Medium" w:cs="Futura Medium"/>
-          <w:b/>
-          <w:bCs/>
         </w:rPr>
       </w:pPr>
     </w:p>
@@ -584,25 +1347,799 @@
       <w:pPr>
         <w:rPr>
           <w:rFonts w:ascii="Futura Medium" w:hAnsi="Futura Medium" w:cs="Futura Medium"/>
-          <w:b/>
-          <w:bCs/>
         </w:rPr>
       </w:pPr>
       <w:r>
         <w:rPr>
           <w:rFonts w:ascii="Futura Medium" w:hAnsi="Futura Medium" w:cs="Futura Medium"/>
-          <w:b/>
-          <w:bCs/>
-        </w:rPr>
-        <w:t>The mathematical model</w:t>
+        </w:rPr>
+        <w:t xml:space="preserve">Biological </w:t>
+      </w:r>
+      <w:r>
+        <w:rPr>
+          <w:rFonts w:ascii="Futura Medium" w:hAnsi="Futura Medium" w:cs="Futura Medium"/>
+        </w:rPr>
+        <w:t>CO</w:t>
+      </w:r>
+      <w:r>
+        <w:rPr>
+          <w:rFonts w:ascii="Futura Medium" w:hAnsi="Futura Medium" w:cs="Futura Medium"/>
+          <w:vertAlign w:val="subscript"/>
+        </w:rPr>
+        <w:t>2</w:t>
+      </w:r>
+      <w:r>
+        <w:rPr>
+          <w:rFonts w:ascii="Futura Medium" w:hAnsi="Futura Medium" w:cs="Futura Medium"/>
+        </w:rPr>
+        <w:t xml:space="preserve"> </w:t>
+      </w:r>
+      <w:r>
+        <w:rPr>
+          <w:rFonts w:ascii="Futura Medium" w:hAnsi="Futura Medium" w:cs="Futura Medium"/>
+        </w:rPr>
+        <w:t xml:space="preserve">removal in the ocean is referred to by the shorthand blue carbon. </w:t>
+      </w:r>
+      <w:r>
+        <w:rPr>
+          <w:rFonts w:ascii="Futura Medium" w:hAnsi="Futura Medium" w:cs="Futura Medium"/>
+        </w:rPr>
+        <w:t>M</w:t>
+      </w:r>
+      <w:r>
+        <w:rPr>
+          <w:rFonts w:ascii="Futura Medium" w:hAnsi="Futura Medium" w:cs="Futura Medium"/>
+        </w:rPr>
+        <w:t xml:space="preserve">acroalgae have recently moved into the focus of blue carbon </w:t>
+      </w:r>
+      <w:r>
+        <w:rPr>
+          <w:rFonts w:ascii="Futura Medium" w:hAnsi="Futura Medium" w:cs="Futura Medium"/>
+        </w:rPr>
+        <w:t>{</w:t>
+      </w:r>
+      <w:proofErr w:type="spellStart"/>
+      <w:r>
+        <w:rPr>
+          <w:rFonts w:ascii="Futura Medium" w:hAnsi="Futura Medium" w:cs="Futura Medium"/>
+        </w:rPr>
+        <w:t>Pessarrodona</w:t>
+      </w:r>
+      <w:proofErr w:type="spellEnd"/>
+      <w:r>
+        <w:rPr>
+          <w:rFonts w:ascii="Futura Medium" w:hAnsi="Futura Medium" w:cs="Futura Medium"/>
+        </w:rPr>
+        <w:t xml:space="preserve"> et al., 2023, #24779}</w:t>
+      </w:r>
+      <w:r>
+        <w:rPr>
+          <w:rFonts w:ascii="Futura Medium" w:hAnsi="Futura Medium" w:cs="Futura Medium"/>
+        </w:rPr>
+        <w:t>, primarily d</w:t>
+      </w:r>
+      <w:r>
+        <w:rPr>
+          <w:rFonts w:ascii="Futura Medium" w:hAnsi="Futura Medium" w:cs="Futura Medium"/>
+        </w:rPr>
+        <w:t xml:space="preserve">ue to their </w:t>
+      </w:r>
+      <w:r>
+        <w:rPr>
+          <w:rFonts w:ascii="Futura Medium" w:hAnsi="Futura Medium" w:cs="Futura Medium"/>
+        </w:rPr>
+        <w:t>substantial</w:t>
+      </w:r>
+      <w:r>
+        <w:rPr>
+          <w:rFonts w:ascii="Futura Medium" w:hAnsi="Futura Medium" w:cs="Futura Medium"/>
+        </w:rPr>
+        <w:t xml:space="preserve"> </w:t>
+      </w:r>
+      <w:r>
+        <w:rPr>
+          <w:rFonts w:ascii="Futura Medium" w:hAnsi="Futura Medium" w:cs="Futura Medium"/>
+        </w:rPr>
+        <w:t>global area</w:t>
+      </w:r>
+      <w:r>
+        <w:rPr>
+          <w:rFonts w:ascii="Futura Medium" w:hAnsi="Futura Medium" w:cs="Futura Medium"/>
+        </w:rPr>
+        <w:t xml:space="preserve"> </w:t>
+      </w:r>
+      <w:r>
+        <w:rPr>
+          <w:rFonts w:ascii="Futura Medium" w:hAnsi="Futura Medium" w:cs="Futura Medium"/>
+        </w:rPr>
+        <w:t>{Duarte et al., 2022, #38140}</w:t>
+      </w:r>
+      <w:r>
+        <w:rPr>
+          <w:rFonts w:ascii="Futura Medium" w:hAnsi="Futura Medium" w:cs="Futura Medium"/>
+        </w:rPr>
+        <w:t xml:space="preserve">, standing biomass </w:t>
+      </w:r>
+      <w:r>
+        <w:rPr>
+          <w:rFonts w:ascii="Futura Medium" w:hAnsi="Futura Medium" w:cs="Futura Medium"/>
+        </w:rPr>
+        <w:t>{Creed et al., 2019, #70680}</w:t>
+      </w:r>
+      <w:r>
+        <w:rPr>
+          <w:rFonts w:ascii="Futura Medium" w:hAnsi="Futura Medium" w:cs="Futura Medium"/>
+        </w:rPr>
+        <w:t xml:space="preserve">, productivity </w:t>
+      </w:r>
+      <w:r>
+        <w:rPr>
+          <w:rFonts w:ascii="Futura Medium" w:hAnsi="Futura Medium" w:cs="Futura Medium"/>
+        </w:rPr>
+        <w:t>{</w:t>
+      </w:r>
+      <w:proofErr w:type="spellStart"/>
+      <w:r>
+        <w:rPr>
+          <w:rFonts w:ascii="Futura Medium" w:hAnsi="Futura Medium" w:cs="Futura Medium"/>
+        </w:rPr>
+        <w:t>Pessarrodona</w:t>
+      </w:r>
+      <w:proofErr w:type="spellEnd"/>
+      <w:r>
+        <w:rPr>
+          <w:rFonts w:ascii="Futura Medium" w:hAnsi="Futura Medium" w:cs="Futura Medium"/>
+        </w:rPr>
+        <w:t xml:space="preserve"> et al., 2022, #59703}</w:t>
+      </w:r>
+      <w:r>
+        <w:rPr>
+          <w:rFonts w:ascii="Futura Medium" w:hAnsi="Futura Medium" w:cs="Futura Medium"/>
+        </w:rPr>
+        <w:t xml:space="preserve"> </w:t>
+      </w:r>
+      <w:r>
+        <w:rPr>
+          <w:rFonts w:ascii="Futura Medium" w:hAnsi="Futura Medium" w:cs="Futura Medium"/>
+        </w:rPr>
+        <w:t xml:space="preserve">and </w:t>
+      </w:r>
+      <w:r>
+        <w:rPr>
+          <w:rFonts w:ascii="Futura Medium" w:hAnsi="Futura Medium" w:cs="Futura Medium"/>
+        </w:rPr>
+        <w:t xml:space="preserve">detrital </w:t>
+      </w:r>
+      <w:r>
+        <w:rPr>
+          <w:rFonts w:ascii="Futura Medium" w:hAnsi="Futura Medium" w:cs="Futura Medium"/>
+        </w:rPr>
+        <w:t xml:space="preserve">export </w:t>
+      </w:r>
+      <w:r>
+        <w:rPr>
+          <w:rFonts w:ascii="Futura Medium" w:hAnsi="Futura Medium" w:cs="Futura Medium"/>
+        </w:rPr>
+        <w:t>{</w:t>
+      </w:r>
+      <w:proofErr w:type="spellStart"/>
+      <w:r>
+        <w:rPr>
+          <w:rFonts w:ascii="Futura Medium" w:hAnsi="Futura Medium" w:cs="Futura Medium"/>
+        </w:rPr>
+        <w:t>Filbee</w:t>
+      </w:r>
+      <w:proofErr w:type="spellEnd"/>
+      <w:r>
+        <w:rPr>
+          <w:rFonts w:ascii="Futura Medium" w:hAnsi="Futura Medium" w:cs="Futura Medium"/>
+        </w:rPr>
+        <w:t>-Dexter et al., 2024, #27977}</w:t>
+      </w:r>
+      <w:r>
+        <w:rPr>
+          <w:rFonts w:ascii="Futura Medium" w:hAnsi="Futura Medium" w:cs="Futura Medium"/>
+        </w:rPr>
+        <w:t>.</w:t>
+      </w:r>
+      <w:r>
+        <w:rPr>
+          <w:rFonts w:ascii="Futura Medium" w:hAnsi="Futura Medium" w:cs="Futura Medium"/>
+        </w:rPr>
+        <w:t xml:space="preserve"> </w:t>
+      </w:r>
+      <w:r>
+        <w:rPr>
+          <w:rFonts w:ascii="Futura Medium" w:hAnsi="Futura Medium" w:cs="Futura Medium"/>
+        </w:rPr>
+        <w:t xml:space="preserve">Multiplying </w:t>
+      </w:r>
+      <w:r>
+        <w:rPr>
+          <w:rFonts w:ascii="Futura Medium" w:hAnsi="Futura Medium" w:cs="Futura Medium"/>
+        </w:rPr>
+        <w:t xml:space="preserve">the </w:t>
+      </w:r>
+      <w:r>
+        <w:rPr>
+          <w:rFonts w:ascii="Futura Medium" w:hAnsi="Futura Medium" w:cs="Futura Medium"/>
+        </w:rPr>
+        <w:t xml:space="preserve">maximal </w:t>
+      </w:r>
+      <w:r>
+        <w:rPr>
+          <w:rFonts w:ascii="Futura Medium" w:hAnsi="Futura Medium" w:cs="Futura Medium"/>
+        </w:rPr>
+        <w:t>cover</w:t>
+      </w:r>
+      <w:r>
+        <w:rPr>
+          <w:rFonts w:ascii="Futura Medium" w:hAnsi="Futura Medium" w:cs="Futura Medium"/>
+        </w:rPr>
+        <w:t xml:space="preserve"> of 7.22 million km</w:t>
+      </w:r>
+      <w:r>
+        <w:rPr>
+          <w:rFonts w:ascii="Futura Medium" w:hAnsi="Futura Medium" w:cs="Futura Medium"/>
+          <w:vertAlign w:val="superscript"/>
+        </w:rPr>
+        <w:t>2</w:t>
+      </w:r>
+      <w:r>
+        <w:rPr>
+          <w:rFonts w:ascii="Futura Medium" w:hAnsi="Futura Medium" w:cs="Futura Medium"/>
+        </w:rPr>
+        <w:t xml:space="preserve"> </w:t>
+      </w:r>
+      <w:r>
+        <w:rPr>
+          <w:rFonts w:ascii="Futura Medium" w:hAnsi="Futura Medium" w:cs="Futura Medium"/>
+        </w:rPr>
+        <w:t>{Duarte et al., 2022, #38140}</w:t>
+      </w:r>
+      <w:r>
+        <w:rPr>
+          <w:rFonts w:ascii="Futura Medium" w:hAnsi="Futura Medium" w:cs="Futura Medium"/>
+        </w:rPr>
+        <w:t xml:space="preserve"> </w:t>
+      </w:r>
+      <w:r>
+        <w:rPr>
+          <w:rFonts w:ascii="Futura Medium" w:hAnsi="Futura Medium" w:cs="Futura Medium"/>
+        </w:rPr>
+        <w:t xml:space="preserve">by the </w:t>
+      </w:r>
+      <w:r>
+        <w:rPr>
+          <w:rFonts w:ascii="Futura Medium" w:hAnsi="Futura Medium" w:cs="Futura Medium"/>
+        </w:rPr>
+        <w:t>100 kg m</w:t>
+      </w:r>
+      <w:r>
+        <w:rPr>
+          <w:rFonts w:ascii="Futura Medium" w:hAnsi="Futura Medium" w:cs="Futura Medium"/>
+          <w:vertAlign w:val="superscript"/>
+        </w:rPr>
+        <w:t>−</w:t>
+      </w:r>
+      <w:r>
+        <w:rPr>
+          <w:rFonts w:ascii="Futura Medium" w:hAnsi="Futura Medium" w:cs="Futura Medium"/>
+          <w:vertAlign w:val="superscript"/>
+        </w:rPr>
+        <w:t>2</w:t>
+      </w:r>
+      <w:r>
+        <w:rPr>
+          <w:rFonts w:ascii="Futura Medium" w:hAnsi="Futura Medium" w:cs="Futura Medium"/>
+        </w:rPr>
+        <w:t xml:space="preserve"> threshold </w:t>
+      </w:r>
+      <w:r>
+        <w:rPr>
+          <w:rFonts w:ascii="Futura Medium" w:hAnsi="Futura Medium" w:cs="Futura Medium"/>
+        </w:rPr>
+        <w:t>{Creed et al., 2019, #70680}</w:t>
+      </w:r>
+      <w:r>
+        <w:rPr>
+          <w:rFonts w:ascii="Futura Medium" w:hAnsi="Futura Medium" w:cs="Futura Medium"/>
+        </w:rPr>
+        <w:t xml:space="preserve"> and a maximal carbon content </w:t>
+      </w:r>
+      <w:r>
+        <w:rPr>
+          <w:rFonts w:ascii="Futura Medium" w:hAnsi="Futura Medium" w:cs="Futura Medium"/>
+        </w:rPr>
+        <w:t xml:space="preserve">of </w:t>
+      </w:r>
+      <w:r>
+        <w:rPr>
+          <w:rFonts w:ascii="Futura Medium" w:hAnsi="Futura Medium" w:cs="Futura Medium"/>
+        </w:rPr>
+        <w:t>40%</w:t>
+      </w:r>
+      <w:r>
+        <w:rPr>
+          <w:rFonts w:ascii="Futura Medium" w:hAnsi="Futura Medium" w:cs="Futura Medium"/>
+        </w:rPr>
+        <w:t xml:space="preserve"> </w:t>
+      </w:r>
+      <w:r>
+        <w:rPr>
+          <w:rFonts w:ascii="Futura Medium" w:hAnsi="Futura Medium" w:cs="Futura Medium"/>
+        </w:rPr>
+        <w:t>{</w:t>
+      </w:r>
+      <w:proofErr w:type="spellStart"/>
+      <w:r>
+        <w:rPr>
+          <w:rFonts w:ascii="Futura Medium" w:hAnsi="Futura Medium" w:cs="Futura Medium"/>
+        </w:rPr>
+        <w:t>Pessarrodona</w:t>
+      </w:r>
+      <w:proofErr w:type="spellEnd"/>
+      <w:r>
+        <w:rPr>
+          <w:rFonts w:ascii="Futura Medium" w:hAnsi="Futura Medium" w:cs="Futura Medium"/>
+        </w:rPr>
+        <w:t xml:space="preserve"> et al., 2022, #59703}</w:t>
+      </w:r>
+      <w:r>
+        <w:rPr>
+          <w:rFonts w:ascii="Futura Medium" w:hAnsi="Futura Medium" w:cs="Futura Medium"/>
+        </w:rPr>
+        <w:t xml:space="preserve"> </w:t>
+      </w:r>
+      <w:r>
+        <w:rPr>
+          <w:rFonts w:ascii="Futura Medium" w:hAnsi="Futura Medium" w:cs="Futura Medium"/>
+        </w:rPr>
+        <w:t>yields a</w:t>
+      </w:r>
+      <w:r>
+        <w:rPr>
+          <w:rFonts w:ascii="Futura Medium" w:hAnsi="Futura Medium" w:cs="Futura Medium"/>
+        </w:rPr>
+        <w:t xml:space="preserve"> hard</w:t>
+      </w:r>
+      <w:r>
+        <w:rPr>
+          <w:rFonts w:ascii="Futura Medium" w:hAnsi="Futura Medium" w:cs="Futura Medium"/>
+        </w:rPr>
+        <w:t xml:space="preserve"> upper limit </w:t>
+      </w:r>
+      <w:r>
+        <w:rPr>
+          <w:rFonts w:ascii="Futura Medium" w:hAnsi="Futura Medium" w:cs="Futura Medium"/>
+        </w:rPr>
+        <w:t>of 289 Gt</w:t>
+      </w:r>
+      <w:r>
+        <w:rPr>
+          <w:rFonts w:ascii="Futura Medium" w:hAnsi="Futura Medium" w:cs="Futura Medium"/>
+        </w:rPr>
+        <w:t xml:space="preserve"> C</w:t>
+      </w:r>
+      <w:r>
+        <w:rPr>
+          <w:rFonts w:ascii="Futura Medium" w:hAnsi="Futura Medium" w:cs="Futura Medium"/>
+        </w:rPr>
+        <w:t xml:space="preserve">, or about 40% of all anthropogenic </w:t>
+      </w:r>
+      <w:r>
+        <w:rPr>
+          <w:rFonts w:ascii="Futura Medium" w:hAnsi="Futura Medium" w:cs="Futura Medium"/>
+        </w:rPr>
+        <w:t>CO</w:t>
+      </w:r>
+      <w:r>
+        <w:rPr>
+          <w:rFonts w:ascii="Futura Medium" w:hAnsi="Futura Medium" w:cs="Futura Medium"/>
+          <w:vertAlign w:val="subscript"/>
+        </w:rPr>
+        <w:t>2</w:t>
+      </w:r>
+      <w:r>
+        <w:rPr>
+          <w:rFonts w:ascii="Futura Medium" w:hAnsi="Futura Medium" w:cs="Futura Medium"/>
+        </w:rPr>
+        <w:t xml:space="preserve"> </w:t>
+      </w:r>
+      <w:r>
+        <w:rPr>
+          <w:rFonts w:ascii="Futura Medium" w:hAnsi="Futura Medium" w:cs="Futura Medium"/>
+        </w:rPr>
+        <w:t xml:space="preserve">emissions to date </w:t>
+      </w:r>
+      <w:r>
+        <w:rPr>
+          <w:rFonts w:ascii="Futura Medium" w:hAnsi="Futura Medium" w:cs="Futura Medium"/>
+        </w:rPr>
+        <w:t>{</w:t>
+      </w:r>
+      <w:proofErr w:type="spellStart"/>
+      <w:r>
+        <w:rPr>
+          <w:rFonts w:ascii="Futura Medium" w:hAnsi="Futura Medium" w:cs="Futura Medium"/>
+        </w:rPr>
+        <w:t>Friedlingstein</w:t>
+      </w:r>
+      <w:proofErr w:type="spellEnd"/>
+      <w:r>
+        <w:rPr>
+          <w:rFonts w:ascii="Futura Medium" w:hAnsi="Futura Medium" w:cs="Futura Medium"/>
+        </w:rPr>
+        <w:t xml:space="preserve"> et al., 2024, #94143}</w:t>
+      </w:r>
+      <w:r>
+        <w:rPr>
+          <w:rFonts w:ascii="Futura Medium" w:hAnsi="Futura Medium" w:cs="Futura Medium"/>
+        </w:rPr>
+        <w:t xml:space="preserve">, </w:t>
+      </w:r>
+      <w:r>
+        <w:rPr>
+          <w:rFonts w:ascii="Futura Medium" w:hAnsi="Futura Medium" w:cs="Futura Medium"/>
+        </w:rPr>
+        <w:t>for</w:t>
+      </w:r>
+      <w:r>
+        <w:rPr>
+          <w:rFonts w:ascii="Futura Medium" w:hAnsi="Futura Medium" w:cs="Futura Medium"/>
+        </w:rPr>
+        <w:t xml:space="preserve"> the living </w:t>
+      </w:r>
+      <w:r>
+        <w:rPr>
+          <w:rFonts w:ascii="Futura Medium" w:hAnsi="Futura Medium" w:cs="Futura Medium"/>
+        </w:rPr>
+        <w:t xml:space="preserve">macroalgal </w:t>
+      </w:r>
+      <w:r>
+        <w:rPr>
+          <w:rFonts w:ascii="Futura Medium" w:hAnsi="Futura Medium" w:cs="Futura Medium"/>
+        </w:rPr>
+        <w:t xml:space="preserve">carbon sink. </w:t>
+      </w:r>
+      <w:r>
+        <w:rPr>
+          <w:rFonts w:ascii="Futura Medium" w:hAnsi="Futura Medium" w:cs="Futura Medium"/>
+        </w:rPr>
+        <w:t xml:space="preserve">However, global macroalgae are thought to assimilate </w:t>
+      </w:r>
+      <w:r>
+        <w:rPr>
+          <w:rFonts w:ascii="Futura Medium" w:hAnsi="Futura Medium" w:cs="Futura Medium"/>
+        </w:rPr>
+        <w:t xml:space="preserve">1.32 </w:t>
+      </w:r>
+      <w:r>
+        <w:rPr>
+          <w:rFonts w:ascii="Futura Medium" w:hAnsi="Futura Medium" w:cs="Futura Medium"/>
+        </w:rPr>
+        <w:t>Gt C y</w:t>
+      </w:r>
+      <w:r>
+        <w:rPr>
+          <w:rFonts w:ascii="Futura Medium" w:hAnsi="Futura Medium" w:cs="Futura Medium"/>
+          <w:vertAlign w:val="superscript"/>
+        </w:rPr>
+        <w:t>−</w:t>
+      </w:r>
+      <w:r>
+        <w:rPr>
+          <w:rFonts w:ascii="Futura Medium" w:hAnsi="Futura Medium" w:cs="Futura Medium"/>
+          <w:vertAlign w:val="superscript"/>
+        </w:rPr>
+        <w:t>1</w:t>
+      </w:r>
+      <w:r>
+        <w:rPr>
+          <w:rFonts w:ascii="Futura Medium" w:hAnsi="Futura Medium" w:cs="Futura Medium"/>
+        </w:rPr>
+        <w:t xml:space="preserve"> </w:t>
+      </w:r>
+      <w:r>
+        <w:rPr>
+          <w:rFonts w:ascii="Futura Medium" w:hAnsi="Futura Medium" w:cs="Futura Medium"/>
+        </w:rPr>
+        <w:t>{Duarte et al., 2022, #38140}</w:t>
+      </w:r>
+      <w:r>
+        <w:rPr>
+          <w:rFonts w:ascii="Futura Medium" w:hAnsi="Futura Medium" w:cs="Futura Medium"/>
+        </w:rPr>
+        <w:t xml:space="preserve"> of which</w:t>
+      </w:r>
+      <w:r>
+        <w:rPr>
+          <w:rFonts w:ascii="Futura Medium" w:hAnsi="Futura Medium" w:cs="Futura Medium"/>
+        </w:rPr>
+        <w:t xml:space="preserve"> </w:t>
+      </w:r>
+      <w:r>
+        <w:rPr>
+          <w:rFonts w:ascii="Futura Medium" w:hAnsi="Futura Medium" w:cs="Futura Medium"/>
+        </w:rPr>
+        <w:t>61%</w:t>
+      </w:r>
+      <w:r>
+        <w:rPr>
+          <w:rFonts w:ascii="Futura Medium" w:hAnsi="Futura Medium" w:cs="Futura Medium"/>
+        </w:rPr>
+        <w:t xml:space="preserve"> </w:t>
+      </w:r>
+      <w:r>
+        <w:rPr>
+          <w:rFonts w:ascii="Futura Medium" w:hAnsi="Futura Medium" w:cs="Futura Medium"/>
+        </w:rPr>
+        <w:t xml:space="preserve">is exported as detritus </w:t>
+      </w:r>
+      <w:r>
+        <w:rPr>
+          <w:rFonts w:ascii="Futura Medium" w:hAnsi="Futura Medium" w:cs="Futura Medium"/>
+        </w:rPr>
+        <w:t>{</w:t>
+      </w:r>
+      <w:proofErr w:type="spellStart"/>
+      <w:r>
+        <w:rPr>
+          <w:rFonts w:ascii="Futura Medium" w:hAnsi="Futura Medium" w:cs="Futura Medium"/>
+        </w:rPr>
+        <w:t>Pessarrodona</w:t>
+      </w:r>
+      <w:proofErr w:type="spellEnd"/>
+      <w:r>
+        <w:rPr>
+          <w:rFonts w:ascii="Futura Medium" w:hAnsi="Futura Medium" w:cs="Futura Medium"/>
+        </w:rPr>
+        <w:t xml:space="preserve"> et al., 2023, #24779}</w:t>
+      </w:r>
+      <w:r>
+        <w:rPr>
+          <w:rFonts w:ascii="Futura Medium" w:hAnsi="Futura Medium" w:cs="Futura Medium"/>
+        </w:rPr>
+        <w:t xml:space="preserve">, </w:t>
+      </w:r>
+      <w:r>
+        <w:rPr>
+          <w:rFonts w:ascii="Futura Medium" w:hAnsi="Futura Medium" w:cs="Futura Medium"/>
+        </w:rPr>
+        <w:t xml:space="preserve">so 0.81 </w:t>
+      </w:r>
+      <w:r>
+        <w:rPr>
+          <w:rFonts w:ascii="Futura Medium" w:hAnsi="Futura Medium" w:cs="Futura Medium"/>
+        </w:rPr>
+        <w:t>Gt C y</w:t>
+      </w:r>
+      <w:r>
+        <w:rPr>
+          <w:rFonts w:ascii="Futura Medium" w:hAnsi="Futura Medium" w:cs="Futura Medium"/>
+          <w:vertAlign w:val="superscript"/>
+        </w:rPr>
+        <w:t>−</w:t>
+      </w:r>
+      <w:r>
+        <w:rPr>
+          <w:rFonts w:ascii="Futura Medium" w:hAnsi="Futura Medium" w:cs="Futura Medium"/>
+          <w:vertAlign w:val="superscript"/>
+        </w:rPr>
+        <w:t>1</w:t>
+      </w:r>
+      <w:r>
+        <w:rPr>
+          <w:rFonts w:ascii="Futura Medium" w:hAnsi="Futura Medium" w:cs="Futura Medium"/>
+        </w:rPr>
+        <w:t xml:space="preserve">, or about 7% of annual </w:t>
+      </w:r>
+      <w:r>
+        <w:rPr>
+          <w:rFonts w:ascii="Futura Medium" w:hAnsi="Futura Medium" w:cs="Futura Medium"/>
+        </w:rPr>
+        <w:t xml:space="preserve">anthropogenic </w:t>
+      </w:r>
+      <w:r>
+        <w:rPr>
+          <w:rFonts w:ascii="Futura Medium" w:hAnsi="Futura Medium" w:cs="Futura Medium"/>
+        </w:rPr>
+        <w:t>CO</w:t>
+      </w:r>
+      <w:r>
+        <w:rPr>
+          <w:rFonts w:ascii="Futura Medium" w:hAnsi="Futura Medium" w:cs="Futura Medium"/>
+          <w:vertAlign w:val="subscript"/>
+        </w:rPr>
+        <w:t>2</w:t>
+      </w:r>
+      <w:r>
+        <w:rPr>
+          <w:rFonts w:ascii="Futura Medium" w:hAnsi="Futura Medium" w:cs="Futura Medium"/>
+        </w:rPr>
+        <w:t xml:space="preserve"> </w:t>
+      </w:r>
+      <w:r>
+        <w:rPr>
+          <w:rFonts w:ascii="Futura Medium" w:hAnsi="Futura Medium" w:cs="Futura Medium"/>
+        </w:rPr>
+        <w:t xml:space="preserve">emissions </w:t>
+      </w:r>
+      <w:r>
+        <w:rPr>
+          <w:rFonts w:ascii="Futura Medium" w:hAnsi="Futura Medium" w:cs="Futura Medium"/>
+        </w:rPr>
+        <w:t>{</w:t>
+      </w:r>
+      <w:proofErr w:type="spellStart"/>
+      <w:r>
+        <w:rPr>
+          <w:rFonts w:ascii="Futura Medium" w:hAnsi="Futura Medium" w:cs="Futura Medium"/>
+        </w:rPr>
+        <w:t>Friedlingstein</w:t>
+      </w:r>
+      <w:proofErr w:type="spellEnd"/>
+      <w:r>
+        <w:rPr>
+          <w:rFonts w:ascii="Futura Medium" w:hAnsi="Futura Medium" w:cs="Futura Medium"/>
+        </w:rPr>
+        <w:t xml:space="preserve"> et al., 2024, #94143}</w:t>
+      </w:r>
+      <w:r>
+        <w:rPr>
+          <w:rFonts w:ascii="Futura Medium" w:hAnsi="Futura Medium" w:cs="Futura Medium"/>
+        </w:rPr>
+        <w:t>,</w:t>
+      </w:r>
+      <w:r>
+        <w:rPr>
+          <w:rFonts w:ascii="Futura Medium" w:hAnsi="Futura Medium" w:cs="Futura Medium"/>
+        </w:rPr>
+        <w:t xml:space="preserve"> </w:t>
+      </w:r>
+      <w:r>
+        <w:rPr>
+          <w:rFonts w:ascii="Futura Medium" w:hAnsi="Futura Medium" w:cs="Futura Medium"/>
+        </w:rPr>
+        <w:t>may enter</w:t>
+      </w:r>
+      <w:r>
+        <w:rPr>
+          <w:rFonts w:ascii="Futura Medium" w:hAnsi="Futura Medium" w:cs="Futura Medium"/>
+        </w:rPr>
+        <w:t xml:space="preserve"> </w:t>
+      </w:r>
+      <w:r>
+        <w:rPr>
+          <w:rFonts w:ascii="Futura Medium" w:hAnsi="Futura Medium" w:cs="Futura Medium"/>
+        </w:rPr>
+        <w:t>the detrital pool.</w:t>
+      </w:r>
+      <w:r>
+        <w:rPr>
+          <w:rFonts w:ascii="Futura Medium" w:hAnsi="Futura Medium" w:cs="Futura Medium"/>
+        </w:rPr>
+        <w:t xml:space="preserve"> </w:t>
+      </w:r>
+      <w:r>
+        <w:rPr>
+          <w:rFonts w:ascii="Futura Medium" w:hAnsi="Futura Medium" w:cs="Futura Medium"/>
+        </w:rPr>
+        <w:t>Viewed cumulatively this</w:t>
+      </w:r>
+      <w:r>
+        <w:rPr>
+          <w:rFonts w:ascii="Futura Medium" w:hAnsi="Futura Medium" w:cs="Futura Medium"/>
+        </w:rPr>
+        <w:t xml:space="preserve"> is clearly </w:t>
+      </w:r>
+      <w:r>
+        <w:rPr>
+          <w:rFonts w:ascii="Futura Medium" w:hAnsi="Futura Medium" w:cs="Futura Medium"/>
+        </w:rPr>
+        <w:t xml:space="preserve">the more substantial carbon sink. </w:t>
+      </w:r>
+      <w:r>
+        <w:rPr>
+          <w:rFonts w:ascii="Futura Medium" w:hAnsi="Futura Medium" w:cs="Futura Medium"/>
+        </w:rPr>
+        <w:t>D</w:t>
+      </w:r>
+      <w:r>
+        <w:rPr>
+          <w:rFonts w:ascii="Futura Medium" w:hAnsi="Futura Medium" w:cs="Futura Medium"/>
+        </w:rPr>
+        <w:t xml:space="preserve">ecomposition </w:t>
+      </w:r>
+      <w:r>
+        <w:rPr>
+          <w:rFonts w:ascii="Futura Medium" w:hAnsi="Futura Medium" w:cs="Futura Medium"/>
+        </w:rPr>
+        <w:t>alone therefore determines</w:t>
+      </w:r>
+      <w:r>
+        <w:rPr>
+          <w:rFonts w:ascii="Futura Medium" w:hAnsi="Futura Medium" w:cs="Futura Medium"/>
+        </w:rPr>
+        <w:t xml:space="preserve"> </w:t>
+      </w:r>
+      <w:r>
+        <w:rPr>
+          <w:rFonts w:ascii="Futura Medium" w:hAnsi="Futura Medium" w:cs="Futura Medium"/>
+        </w:rPr>
+        <w:t xml:space="preserve">whether </w:t>
+      </w:r>
+      <w:r>
+        <w:rPr>
+          <w:rFonts w:ascii="Futura Medium" w:hAnsi="Futura Medium" w:cs="Futura Medium"/>
+        </w:rPr>
+        <w:t>macroalgal blue carbon</w:t>
+      </w:r>
+      <w:r>
+        <w:rPr>
+          <w:rFonts w:ascii="Futura Medium" w:hAnsi="Futura Medium" w:cs="Futura Medium"/>
+        </w:rPr>
+        <w:t xml:space="preserve"> is significant</w:t>
+      </w:r>
+      <w:r>
+        <w:rPr>
+          <w:rFonts w:ascii="Futura Medium" w:hAnsi="Futura Medium" w:cs="Futura Medium"/>
+        </w:rPr>
+        <w:t xml:space="preserve"> or not</w:t>
+      </w:r>
+      <w:r>
+        <w:rPr>
+          <w:rFonts w:ascii="Futura Medium" w:hAnsi="Futura Medium" w:cs="Futura Medium"/>
+        </w:rPr>
+        <w:t xml:space="preserve">. </w:t>
+      </w:r>
+      <w:r>
+        <w:rPr>
+          <w:rFonts w:ascii="Futura Medium" w:hAnsi="Futura Medium" w:cs="Futura Medium"/>
+        </w:rPr>
+        <w:t xml:space="preserve">Despite this, </w:t>
+      </w:r>
+      <w:r>
+        <w:rPr>
+          <w:rFonts w:ascii="Futura Medium" w:hAnsi="Futura Medium" w:cs="Futura Medium"/>
+        </w:rPr>
+        <w:t xml:space="preserve">macroalgal </w:t>
+      </w:r>
+      <w:r>
+        <w:rPr>
+          <w:rFonts w:ascii="Futura Medium" w:hAnsi="Futura Medium" w:cs="Futura Medium"/>
+        </w:rPr>
+        <w:t xml:space="preserve">decomposition </w:t>
+      </w:r>
+      <w:r>
+        <w:rPr>
+          <w:rFonts w:ascii="Futura Medium" w:hAnsi="Futura Medium" w:cs="Futura Medium"/>
+        </w:rPr>
+        <w:t>remains</w:t>
+      </w:r>
+      <w:r>
+        <w:rPr>
+          <w:rFonts w:ascii="Futura Medium" w:hAnsi="Futura Medium" w:cs="Futura Medium"/>
+        </w:rPr>
+        <w:t xml:space="preserve"> </w:t>
+      </w:r>
+      <w:r>
+        <w:rPr>
+          <w:rFonts w:ascii="Futura Medium" w:hAnsi="Futura Medium" w:cs="Futura Medium"/>
+        </w:rPr>
+        <w:t xml:space="preserve">comparatively </w:t>
+      </w:r>
+      <w:r>
+        <w:rPr>
+          <w:rFonts w:ascii="Futura Medium" w:hAnsi="Futura Medium" w:cs="Futura Medium"/>
+        </w:rPr>
+        <w:t>poorly understood.</w:t>
       </w:r>
     </w:p>
     <w:p>
       <w:pPr>
         <w:rPr>
           <w:rFonts w:ascii="Futura Medium" w:hAnsi="Futura Medium" w:cs="Futura Medium"/>
-          <w:b/>
-          <w:bCs/>
         </w:rPr>
       </w:pPr>
     </w:p>
@@ -617,18 +2154,576 @@
       <w:r>
         <w:rPr>
           <w:rFonts w:ascii="Futura Medium" w:hAnsi="Futura Medium" w:cs="Futura Medium"/>
-          <w:b/>
-          <w:bCs/>
-        </w:rPr>
-        <w:t>Implementation in R</w:t>
-      </w:r>
-      <w:r>
-        <w:rPr>
-          <w:rFonts w:ascii="Futura Medium" w:hAnsi="Futura Medium" w:cs="Futura Medium"/>
-          <w:b/>
-          <w:bCs/>
-        </w:rPr>
-        <w:t xml:space="preserve"> and Stan</w:t>
+        </w:rPr>
+        <w:t xml:space="preserve">Phycologists have never been able to </w:t>
+      </w:r>
+      <w:r>
+        <w:rPr>
+          <w:rFonts w:ascii="Futura Medium" w:hAnsi="Futura Medium" w:cs="Futura Medium"/>
+        </w:rPr>
+        <w:t>properly model macroalgal decomposition.</w:t>
+      </w:r>
+      <w:r>
+        <w:rPr>
+          <w:rFonts w:ascii="Futura Medium" w:hAnsi="Futura Medium" w:cs="Futura Medium"/>
+        </w:rPr>
+        <w:t xml:space="preserve"> </w:t>
+      </w:r>
+      <w:r>
+        <w:rPr>
+          <w:rFonts w:ascii="Futura Medium" w:hAnsi="Futura Medium" w:cs="Futura Medium"/>
+        </w:rPr>
+        <w:t>Decomposition trajectories rarely</w:t>
+      </w:r>
+      <w:r>
+        <w:rPr>
+          <w:rFonts w:ascii="Futura Medium" w:hAnsi="Futura Medium" w:cs="Futura Medium"/>
+        </w:rPr>
+        <w:t xml:space="preserve"> </w:t>
+      </w:r>
+      <w:r>
+        <w:rPr>
+          <w:rFonts w:ascii="Futura Medium" w:hAnsi="Futura Medium" w:cs="Futura Medium"/>
+        </w:rPr>
+        <w:t>match</w:t>
+      </w:r>
+      <w:r>
+        <w:rPr>
+          <w:rFonts w:ascii="Futura Medium" w:hAnsi="Futura Medium" w:cs="Futura Medium"/>
+        </w:rPr>
+        <w:t xml:space="preserve"> </w:t>
+      </w:r>
+      <w:r>
+        <w:rPr>
+          <w:rFonts w:ascii="Futura Medium" w:hAnsi="Futura Medium" w:cs="Futura Medium"/>
+        </w:rPr>
+        <w:t>Equation 3</w:t>
+      </w:r>
+      <w:r>
+        <w:rPr>
+          <w:rFonts w:ascii="Futura Medium" w:hAnsi="Futura Medium" w:cs="Futura Medium"/>
+        </w:rPr>
+        <w:t xml:space="preserve"> (e.g. </w:t>
+      </w:r>
+      <w:r>
+        <w:rPr>
+          <w:rFonts w:ascii="Futura Medium" w:hAnsi="Futura Medium" w:cs="Futura Medium" w:hint="cs"/>
+          <w:b/>
+          <w:bCs/>
+        </w:rPr>
+        <w:t xml:space="preserve">{de </w:t>
+      </w:r>
+      <w:proofErr w:type="spellStart"/>
+      <w:r>
+        <w:rPr>
+          <w:rFonts w:ascii="Futura Medium" w:hAnsi="Futura Medium" w:cs="Futura Medium" w:hint="cs"/>
+          <w:b/>
+          <w:bCs/>
+        </w:rPr>
+        <w:t>Bettignies</w:t>
+      </w:r>
+      <w:proofErr w:type="spellEnd"/>
+      <w:r>
+        <w:rPr>
+          <w:rFonts w:ascii="Futura Medium" w:hAnsi="Futura Medium" w:cs="Futura Medium" w:hint="cs"/>
+          <w:b/>
+          <w:bCs/>
+        </w:rPr>
+        <w:t xml:space="preserve"> et al., 2020, #27484}</w:t>
+      </w:r>
+      <w:r>
+        <w:rPr>
+          <w:rFonts w:ascii="Futura Medium" w:hAnsi="Futura Medium" w:cs="Futura Medium"/>
+          <w:b/>
+          <w:bCs/>
+        </w:rPr>
+        <w:t xml:space="preserve"> </w:t>
+      </w:r>
+      <w:r>
+        <w:rPr>
+          <w:rFonts w:ascii="Futura Medium" w:hAnsi="Futura Medium" w:cs="Futura Medium" w:hint="cs"/>
+          <w:b/>
+          <w:bCs/>
+        </w:rPr>
+        <w:t>{Pedersen et al., 2021, #86830}</w:t>
+      </w:r>
+      <w:r>
+        <w:rPr>
+          <w:rFonts w:ascii="Futura Medium" w:hAnsi="Futura Medium" w:cs="Futura Medium"/>
+        </w:rPr>
+        <w:t>. Most studies have therefore</w:t>
+      </w:r>
+      <w:r>
+        <w:rPr>
+          <w:rFonts w:ascii="Futura Medium" w:hAnsi="Futura Medium" w:cs="Futura Medium"/>
+        </w:rPr>
+        <w:t xml:space="preserve"> </w:t>
+      </w:r>
+      <w:r>
+        <w:rPr>
+          <w:rFonts w:ascii="Futura Medium" w:hAnsi="Futura Medium" w:cs="Futura Medium"/>
+        </w:rPr>
+        <w:t xml:space="preserve">either </w:t>
+      </w:r>
+      <w:r>
+        <w:rPr>
+          <w:rFonts w:ascii="Futura Medium" w:hAnsi="Futura Medium" w:cs="Futura Medium"/>
+        </w:rPr>
+        <w:t xml:space="preserve">refrained from fitting a model </w:t>
+      </w:r>
+      <w:r>
+        <w:rPr>
+          <w:rFonts w:ascii="Futura Medium" w:hAnsi="Futura Medium" w:cs="Futura Medium"/>
+        </w:rPr>
+        <w:t xml:space="preserve">(e.g. </w:t>
+      </w:r>
+      <w:r>
+        <w:rPr>
+          <w:rFonts w:ascii="Futura Medium" w:hAnsi="Futura Medium" w:cs="Futura Medium" w:hint="cs"/>
+          <w:b/>
+          <w:bCs/>
+        </w:rPr>
+        <w:t>{Birch et al., 1983, #5320}</w:t>
+      </w:r>
+      <w:r>
+        <w:rPr>
+          <w:rFonts w:ascii="Futura Medium" w:hAnsi="Futura Medium" w:cs="Futura Medium"/>
+          <w:b/>
+          <w:bCs/>
+        </w:rPr>
+        <w:t xml:space="preserve"> </w:t>
+      </w:r>
+      <w:r>
+        <w:rPr>
+          <w:rFonts w:ascii="Futura Medium" w:hAnsi="Futura Medium" w:cs="Futura Medium" w:hint="cs"/>
+          <w:b/>
+          <w:bCs/>
+        </w:rPr>
+        <w:t>{Albright et al., 1982, #85687}</w:t>
+      </w:r>
+      <w:r>
+        <w:rPr>
+          <w:rFonts w:ascii="Futura Medium" w:hAnsi="Futura Medium" w:cs="Futura Medium"/>
+          <w:b/>
+          <w:bCs/>
+        </w:rPr>
+        <w:t xml:space="preserve"> </w:t>
+      </w:r>
+      <w:r>
+        <w:rPr>
+          <w:rFonts w:ascii="Futura Medium" w:hAnsi="Futura Medium" w:cs="Futura Medium" w:hint="cs"/>
+          <w:b/>
+          <w:bCs/>
+        </w:rPr>
+        <w:t>{Brouwer, 1996, #26704}</w:t>
+      </w:r>
+      <w:r>
+        <w:rPr>
+          <w:rFonts w:ascii="Futura Medium" w:hAnsi="Futura Medium" w:cs="Futura Medium"/>
+          <w:b/>
+          <w:bCs/>
+        </w:rPr>
+        <w:t xml:space="preserve"> </w:t>
+      </w:r>
+      <w:r>
+        <w:rPr>
+          <w:rFonts w:ascii="Futura Medium" w:hAnsi="Futura Medium" w:cs="Futura Medium" w:hint="cs"/>
+          <w:b/>
+          <w:bCs/>
+        </w:rPr>
+        <w:t>{Hamersley et al., 2015, #100187}</w:t>
+      </w:r>
+      <w:r>
+        <w:rPr>
+          <w:rFonts w:ascii="Futura Medium" w:hAnsi="Futura Medium" w:cs="Futura Medium"/>
+          <w:b/>
+          <w:bCs/>
+        </w:rPr>
+        <w:t xml:space="preserve"> or </w:t>
+      </w:r>
+      <w:r>
+        <w:rPr>
+          <w:rFonts w:ascii="Futura Medium" w:hAnsi="Futura Medium" w:cs="Futura Medium"/>
+          <w:b/>
+          <w:bCs/>
+        </w:rPr>
+        <w:t xml:space="preserve">fit linear models (e.g. </w:t>
+      </w:r>
+      <w:r>
+        <w:rPr>
+          <w:rFonts w:ascii="Futura Medium" w:hAnsi="Futura Medium" w:cs="Futura Medium"/>
+        </w:rPr>
+        <w:t>{Bedford and Moore, 1984, #7701}</w:t>
+      </w:r>
+      <w:r>
+        <w:rPr>
+          <w:rFonts w:ascii="Futura Medium" w:hAnsi="Futura Medium" w:cs="Futura Medium"/>
+        </w:rPr>
+        <w:t xml:space="preserve"> </w:t>
+      </w:r>
+      <w:r>
+        <w:rPr>
+          <w:rFonts w:ascii="Futura Medium" w:hAnsi="Futura Medium" w:cs="Futura Medium"/>
+        </w:rPr>
+        <w:t>{Frontier et al., 2021, #5570}</w:t>
+      </w:r>
+      <w:r>
+        <w:rPr>
+          <w:rFonts w:ascii="Futura Medium" w:hAnsi="Futura Medium" w:cs="Futura Medium"/>
+        </w:rPr>
+        <w:t xml:space="preserve"> </w:t>
+      </w:r>
+      <w:r>
+        <w:rPr>
+          <w:rFonts w:ascii="Futura Medium" w:hAnsi="Futura Medium" w:cs="Futura Medium"/>
+        </w:rPr>
+        <w:t>{Wright et al., 2022, #84779}</w:t>
+      </w:r>
+      <w:r>
+        <w:rPr>
+          <w:rFonts w:ascii="Futura Medium" w:hAnsi="Futura Medium" w:cs="Futura Medium"/>
+        </w:rPr>
+        <w:t xml:space="preserve"> </w:t>
+      </w:r>
+      <w:r>
+        <w:rPr>
+          <w:rFonts w:ascii="Futura Medium" w:hAnsi="Futura Medium" w:cs="Futura Medium"/>
+        </w:rPr>
+        <w:t>{</w:t>
+      </w:r>
+      <w:proofErr w:type="spellStart"/>
+      <w:r>
+        <w:rPr>
+          <w:rFonts w:ascii="Futura Medium" w:hAnsi="Futura Medium" w:cs="Futura Medium"/>
+        </w:rPr>
+        <w:t>Filbee</w:t>
+      </w:r>
+      <w:proofErr w:type="spellEnd"/>
+      <w:r>
+        <w:rPr>
+          <w:rFonts w:ascii="Futura Medium" w:hAnsi="Futura Medium" w:cs="Futura Medium"/>
+        </w:rPr>
+        <w:t>-Dexter et al., 2022, #89942}</w:t>
+      </w:r>
+      <w:r>
+        <w:rPr>
+          <w:rFonts w:ascii="Futura Medium" w:hAnsi="Futura Medium" w:cs="Futura Medium"/>
+        </w:rPr>
+        <w:t xml:space="preserve">. </w:t>
+      </w:r>
+      <w:r>
+        <w:rPr>
+          <w:rFonts w:ascii="Futura Medium" w:hAnsi="Futura Medium" w:cs="Futura Medium"/>
+        </w:rPr>
+        <w:t>M</w:t>
+      </w:r>
+      <w:r>
+        <w:rPr>
+          <w:rFonts w:ascii="Futura Medium" w:hAnsi="Futura Medium" w:cs="Futura Medium"/>
+        </w:rPr>
+        <w:t>eta-analys</w:t>
+      </w:r>
+      <w:r>
+        <w:rPr>
+          <w:rFonts w:ascii="Futura Medium" w:hAnsi="Futura Medium" w:cs="Futura Medium"/>
+        </w:rPr>
+        <w:t>e</w:t>
+      </w:r>
+      <w:r>
+        <w:rPr>
+          <w:rFonts w:ascii="Futura Medium" w:hAnsi="Futura Medium" w:cs="Futura Medium"/>
+        </w:rPr>
+        <w:t xml:space="preserve">s </w:t>
+      </w:r>
+      <w:r>
+        <w:rPr>
+          <w:rFonts w:ascii="Futura Medium" w:hAnsi="Futura Medium" w:cs="Futura Medium"/>
+        </w:rPr>
+        <w:t xml:space="preserve">of </w:t>
+      </w:r>
+      <w:r>
+        <w:rPr>
+          <w:rFonts w:ascii="Futura Medium" w:hAnsi="Futura Medium" w:cs="Futura Medium"/>
+          <w:i/>
+          <w:iCs/>
+        </w:rPr>
+        <w:t>k</w:t>
+      </w:r>
+      <w:r>
+        <w:rPr>
+          <w:rFonts w:ascii="Futura Medium" w:hAnsi="Futura Medium" w:cs="Futura Medium"/>
+        </w:rPr>
+        <w:t xml:space="preserve"> (Equation 3) </w:t>
+      </w:r>
+      <w:r>
+        <w:rPr>
+          <w:rFonts w:ascii="Futura Medium" w:hAnsi="Futura Medium" w:cs="Futura Medium"/>
+        </w:rPr>
+        <w:t xml:space="preserve">for macroalgae are not uncommon </w:t>
+      </w:r>
+      <w:r>
+        <w:rPr>
+          <w:rFonts w:ascii="Futura Medium" w:hAnsi="Futura Medium" w:cs="Futura Medium"/>
+        </w:rPr>
+        <w:t>{Enríquez et al., 1993, #29591}</w:t>
+      </w:r>
+      <w:r>
+        <w:rPr>
+          <w:rFonts w:ascii="Futura Medium" w:hAnsi="Futura Medium" w:cs="Futura Medium"/>
+        </w:rPr>
+        <w:t>{Nielsen et al., 2004, #54288}</w:t>
+      </w:r>
+      <w:r>
+        <w:rPr>
+          <w:rFonts w:ascii="Futura Medium" w:hAnsi="Futura Medium" w:cs="Futura Medium"/>
+        </w:rPr>
+        <w:t xml:space="preserve"> </w:t>
+      </w:r>
+      <w:r>
+        <w:rPr>
+          <w:rFonts w:ascii="Futura Medium" w:hAnsi="Futura Medium" w:cs="Futura Medium"/>
+        </w:rPr>
+        <w:t>{Cebrián and Lartigue, 2004, #25394}</w:t>
+      </w:r>
+      <w:r>
+        <w:rPr>
+          <w:rFonts w:ascii="Futura Medium" w:hAnsi="Futura Medium" w:cs="Futura Medium"/>
+        </w:rPr>
+        <w:t xml:space="preserve"> </w:t>
+      </w:r>
+      <w:r>
+        <w:rPr>
+          <w:rFonts w:ascii="Futura Medium" w:hAnsi="Futura Medium" w:cs="Futura Medium"/>
+        </w:rPr>
+        <w:t>{</w:t>
+      </w:r>
+      <w:proofErr w:type="spellStart"/>
+      <w:r>
+        <w:rPr>
+          <w:rFonts w:ascii="Futura Medium" w:hAnsi="Futura Medium" w:cs="Futura Medium"/>
+        </w:rPr>
+        <w:t>Filbee</w:t>
+      </w:r>
+      <w:proofErr w:type="spellEnd"/>
+      <w:r>
+        <w:rPr>
+          <w:rFonts w:ascii="Futura Medium" w:hAnsi="Futura Medium" w:cs="Futura Medium"/>
+        </w:rPr>
+        <w:t>-Dexter et al., 2024, #27977}</w:t>
+      </w:r>
+      <w:r>
+        <w:rPr>
+          <w:rFonts w:ascii="Futura Medium" w:hAnsi="Futura Medium" w:cs="Futura Medium"/>
+        </w:rPr>
+        <w:t xml:space="preserve"> </w:t>
+      </w:r>
+      <w:r>
+        <w:rPr>
+          <w:rFonts w:ascii="Futura Medium" w:hAnsi="Futura Medium" w:cs="Futura Medium"/>
+        </w:rPr>
+        <w:t xml:space="preserve">{Kennedy and Blain, 2025, #108523}{White and </w:t>
+      </w:r>
+      <w:proofErr w:type="spellStart"/>
+      <w:r>
+        <w:rPr>
+          <w:rFonts w:ascii="Futura Medium" w:hAnsi="Futura Medium" w:cs="Futura Medium"/>
+        </w:rPr>
+        <w:t>Norkko</w:t>
+      </w:r>
+      <w:proofErr w:type="spellEnd"/>
+      <w:r>
+        <w:rPr>
+          <w:rFonts w:ascii="Futura Medium" w:hAnsi="Futura Medium" w:cs="Futura Medium"/>
+        </w:rPr>
+        <w:t>, 2025, #37662}</w:t>
+      </w:r>
+      <w:r>
+        <w:rPr>
+          <w:rFonts w:ascii="Futura Medium" w:hAnsi="Futura Medium" w:cs="Futura Medium"/>
+        </w:rPr>
+        <w:t xml:space="preserve">, but have generally assumed </w:t>
+      </w:r>
+      <w:r>
+        <w:rPr>
+          <w:rFonts w:ascii="Futura Medium" w:hAnsi="Futura Medium" w:cs="Futura Medium"/>
+        </w:rPr>
+        <w:t xml:space="preserve">Equation 3 by default and not assessed goodness-of-fit. It is evident that these meta-analyses were hampered by the complexity and diversity of macroalgal decomposition trajectories </w:t>
+      </w:r>
+      <w:r>
+        <w:rPr>
+          <w:rFonts w:ascii="Futura Medium" w:hAnsi="Futura Medium" w:cs="Futura Medium"/>
+        </w:rPr>
+        <w:t>{Kennedy and Blain, 2025, #</w:t>
+      </w:r>
+      <w:proofErr w:type="gramStart"/>
+      <w:r>
+        <w:rPr>
+          <w:rFonts w:ascii="Futura Medium" w:hAnsi="Futura Medium" w:cs="Futura Medium"/>
+        </w:rPr>
+        <w:t>108523}{</w:t>
+      </w:r>
+      <w:proofErr w:type="gramEnd"/>
+      <w:r>
+        <w:rPr>
+          <w:rFonts w:ascii="Futura Medium" w:hAnsi="Futura Medium" w:cs="Futura Medium"/>
+        </w:rPr>
+        <w:t xml:space="preserve">White and </w:t>
+      </w:r>
+      <w:proofErr w:type="spellStart"/>
+      <w:r>
+        <w:rPr>
+          <w:rFonts w:ascii="Futura Medium" w:hAnsi="Futura Medium" w:cs="Futura Medium"/>
+        </w:rPr>
+        <w:t>Norkko</w:t>
+      </w:r>
+      <w:proofErr w:type="spellEnd"/>
+      <w:r>
+        <w:rPr>
+          <w:rFonts w:ascii="Futura Medium" w:hAnsi="Futura Medium" w:cs="Futura Medium"/>
+        </w:rPr>
+        <w:t>, 2025, #37662}</w:t>
+      </w:r>
+      <w:r>
+        <w:rPr>
+          <w:rFonts w:ascii="Futura Medium" w:hAnsi="Futura Medium" w:cs="Futura Medium"/>
+        </w:rPr>
+        <w:t xml:space="preserve">. The only serious attempts at modelling </w:t>
+      </w:r>
+      <w:r>
+        <w:rPr>
+          <w:rFonts w:ascii="Futura Medium" w:hAnsi="Futura Medium" w:cs="Futura Medium"/>
+        </w:rPr>
+        <w:t xml:space="preserve">diverse </w:t>
+      </w:r>
+      <w:r>
+        <w:rPr>
+          <w:rFonts w:ascii="Futura Medium" w:hAnsi="Futura Medium" w:cs="Futura Medium"/>
+        </w:rPr>
+        <w:t>macroalgal decomposition have required</w:t>
+      </w:r>
+      <w:r>
+        <w:rPr>
+          <w:rFonts w:ascii="Futura Medium" w:hAnsi="Futura Medium" w:cs="Futura Medium"/>
+        </w:rPr>
+        <w:t xml:space="preserve"> the logistic </w:t>
+      </w:r>
+      <w:r>
+        <w:rPr>
+          <w:rFonts w:ascii="Futura Medium" w:hAnsi="Futura Medium" w:cs="Futura Medium"/>
+        </w:rPr>
+        <w:t xml:space="preserve">function alongside the exponential </w:t>
+      </w:r>
+      <w:r>
+        <w:rPr>
+          <w:rFonts w:ascii="Futura Medium" w:hAnsi="Futura Medium" w:cs="Futura Medium" w:hint="cs"/>
+          <w:b/>
+          <w:bCs/>
+        </w:rPr>
+        <w:t>{</w:t>
+      </w:r>
+      <w:proofErr w:type="spellStart"/>
+      <w:r>
+        <w:rPr>
+          <w:rFonts w:ascii="Futura Medium" w:hAnsi="Futura Medium" w:cs="Futura Medium" w:hint="cs"/>
+          <w:b/>
+          <w:bCs/>
+        </w:rPr>
+        <w:t>Bourguès</w:t>
+      </w:r>
+      <w:proofErr w:type="spellEnd"/>
+      <w:r>
+        <w:rPr>
+          <w:rFonts w:ascii="Futura Medium" w:hAnsi="Futura Medium" w:cs="Futura Medium" w:hint="cs"/>
+          <w:b/>
+          <w:bCs/>
+        </w:rPr>
+        <w:t xml:space="preserve"> et al., 1996, #</w:t>
+      </w:r>
+      <w:proofErr w:type="gramStart"/>
+      <w:r>
+        <w:rPr>
+          <w:rFonts w:ascii="Futura Medium" w:hAnsi="Futura Medium" w:cs="Futura Medium" w:hint="cs"/>
+          <w:b/>
+          <w:bCs/>
+        </w:rPr>
+        <w:t>24868}</w:t>
+      </w:r>
+      <w:r>
+        <w:rPr>
+          <w:rFonts w:ascii="Futura Medium" w:hAnsi="Futura Medium" w:cs="Futura Medium"/>
+        </w:rPr>
+        <w:t>{</w:t>
+      </w:r>
+      <w:proofErr w:type="gramEnd"/>
+      <w:r>
+        <w:rPr>
+          <w:rFonts w:ascii="Futura Medium" w:hAnsi="Futura Medium" w:cs="Futura Medium"/>
+        </w:rPr>
+        <w:t>Kennedy and Blain, 2025, #108523}</w:t>
+      </w:r>
+      <w:r>
+        <w:rPr>
+          <w:rFonts w:ascii="Futura Medium" w:hAnsi="Futura Medium" w:cs="Futura Medium"/>
+          <w:b/>
+          <w:bCs/>
+        </w:rPr>
+        <w:t>.</w:t>
+      </w:r>
+      <w:r>
+        <w:rPr>
+          <w:rFonts w:ascii="Futura Medium" w:hAnsi="Futura Medium" w:cs="Futura Medium"/>
+          <w:b/>
+          <w:bCs/>
+        </w:rPr>
+        <w:t xml:space="preserve"> </w:t>
+      </w:r>
+      <w:r>
+        <w:rPr>
+          <w:rFonts w:ascii="Futura Medium" w:hAnsi="Futura Medium" w:cs="Futura Medium"/>
+          <w:b/>
+          <w:bCs/>
+        </w:rPr>
+        <w:t xml:space="preserve">This </w:t>
+      </w:r>
+      <w:r>
+        <w:rPr>
+          <w:rFonts w:ascii="Futura Medium" w:hAnsi="Futura Medium" w:cs="Futura Medium"/>
+          <w:b/>
+          <w:bCs/>
+        </w:rPr>
+        <w:t>defeats</w:t>
+      </w:r>
+      <w:r>
+        <w:rPr>
+          <w:rFonts w:ascii="Futura Medium" w:hAnsi="Futura Medium" w:cs="Futura Medium"/>
+          <w:b/>
+          <w:bCs/>
+        </w:rPr>
+        <w:t xml:space="preserve"> the purpose of the model since</w:t>
+      </w:r>
+      <w:r>
+        <w:rPr>
+          <w:rFonts w:ascii="Futura Medium" w:hAnsi="Futura Medium" w:cs="Futura Medium"/>
+          <w:b/>
+          <w:bCs/>
+        </w:rPr>
+        <w:t xml:space="preserve"> the logistic and exponential rate</w:t>
+      </w:r>
+      <w:r>
+        <w:rPr>
+          <w:rFonts w:ascii="Futura Medium" w:hAnsi="Futura Medium" w:cs="Futura Medium"/>
+          <w:b/>
+          <w:bCs/>
+        </w:rPr>
+        <w:t xml:space="preserve"> constants </w:t>
+      </w:r>
+      <w:r>
+        <w:rPr>
+          <w:rFonts w:ascii="Futura Medium" w:hAnsi="Futura Medium" w:cs="Futura Medium"/>
+          <w:b/>
+          <w:bCs/>
+        </w:rPr>
+        <w:t>are not comparable.</w:t>
       </w:r>
     </w:p>
     <w:p>
@@ -654,7 +2749,546 @@
           <w:b/>
           <w:bCs/>
         </w:rPr>
-        <w:t>Discussion</w:t>
+        <w:t xml:space="preserve">We now know </w:t>
+      </w:r>
+      <w:r>
+        <w:rPr>
+          <w:rFonts w:ascii="Futura Medium" w:hAnsi="Futura Medium" w:cs="Futura Medium"/>
+          <w:b/>
+          <w:bCs/>
+        </w:rPr>
+        <w:t>what causes the observed diversity in macroalgal decomposition trajectories.</w:t>
+      </w:r>
+      <w:r>
+        <w:rPr>
+          <w:rFonts w:ascii="Futura Medium" w:hAnsi="Futura Medium" w:cs="Futura Medium"/>
+          <w:b/>
+          <w:bCs/>
+        </w:rPr>
+        <w:t xml:space="preserve"> Early phycologists noticed the need to “pre-kill” macroalgal detritus </w:t>
+      </w:r>
+      <w:r>
+        <w:rPr>
+          <w:rFonts w:ascii="Futura Medium" w:hAnsi="Futura Medium" w:cs="Futura Medium" w:hint="cs"/>
+          <w:b/>
+          <w:bCs/>
+        </w:rPr>
+        <w:t>{Birch et al., 1983, #</w:t>
+      </w:r>
+      <w:proofErr w:type="gramStart"/>
+      <w:r>
+        <w:rPr>
+          <w:rFonts w:ascii="Futura Medium" w:hAnsi="Futura Medium" w:cs="Futura Medium" w:hint="cs"/>
+          <w:b/>
+          <w:bCs/>
+        </w:rPr>
+        <w:t>5320}</w:t>
+      </w:r>
+      <w:r>
+        <w:rPr>
+          <w:rFonts w:ascii="Futura Medium" w:hAnsi="Futura Medium" w:cs="Futura Medium" w:hint="cs"/>
+          <w:b/>
+          <w:bCs/>
+        </w:rPr>
+        <w:t>{</w:t>
+      </w:r>
+      <w:proofErr w:type="gramEnd"/>
+      <w:r>
+        <w:rPr>
+          <w:rFonts w:ascii="Futura Medium" w:hAnsi="Futura Medium" w:cs="Futura Medium" w:hint="cs"/>
+          <w:b/>
+          <w:bCs/>
+        </w:rPr>
+        <w:t>Brouwer, 1996, #</w:t>
+      </w:r>
+      <w:proofErr w:type="gramStart"/>
+      <w:r>
+        <w:rPr>
+          <w:rFonts w:ascii="Futura Medium" w:hAnsi="Futura Medium" w:cs="Futura Medium" w:hint="cs"/>
+          <w:b/>
+          <w:bCs/>
+        </w:rPr>
+        <w:t>26704}</w:t>
+      </w:r>
+      <w:r>
+        <w:rPr>
+          <w:rFonts w:ascii="Futura Medium" w:hAnsi="Futura Medium" w:cs="Futura Medium"/>
+          <w:b/>
+          <w:bCs/>
+        </w:rPr>
+        <w:t>{</w:t>
+      </w:r>
+      <w:proofErr w:type="gramEnd"/>
+      <w:r>
+        <w:rPr>
+          <w:rFonts w:ascii="Futura Medium" w:hAnsi="Futura Medium" w:cs="Futura Medium"/>
+          <w:b/>
+          <w:bCs/>
+        </w:rPr>
+        <w:t xml:space="preserve">Smith and </w:t>
+      </w:r>
+      <w:r>
+        <w:rPr>
+          <w:rFonts w:ascii="Futura Medium" w:hAnsi="Futura Medium" w:cs="Futura Medium"/>
+          <w:b/>
+          <w:bCs/>
+        </w:rPr>
+        <w:lastRenderedPageBreak/>
+        <w:t>Foreman, 1984, #41137}</w:t>
+      </w:r>
+      <w:r>
+        <w:rPr>
+          <w:rFonts w:ascii="Futura Medium" w:hAnsi="Futura Medium" w:cs="Futura Medium"/>
+          <w:b/>
+          <w:bCs/>
+        </w:rPr>
+        <w:t xml:space="preserve"> if it was to behave according to the expectations of the classic model.</w:t>
+      </w:r>
+      <w:r>
+        <w:rPr>
+          <w:rFonts w:ascii="Futura Medium" w:hAnsi="Futura Medium" w:cs="Futura Medium"/>
+          <w:b/>
+          <w:bCs/>
+        </w:rPr>
+        <w:t xml:space="preserve"> </w:t>
+      </w:r>
+      <w:r>
+        <w:rPr>
+          <w:rFonts w:ascii="Futura Medium" w:hAnsi="Futura Medium" w:cs="Futura Medium"/>
+        </w:rPr>
+        <w:t>R</w:t>
+      </w:r>
+      <w:r>
+        <w:rPr>
+          <w:rFonts w:ascii="Futura Medium" w:hAnsi="Futura Medium" w:cs="Futura Medium"/>
+        </w:rPr>
+        <w:t xml:space="preserve">ecently it became evident that </w:t>
+      </w:r>
+      <w:r>
+        <w:rPr>
+          <w:rFonts w:ascii="Futura Medium" w:hAnsi="Futura Medium" w:cs="Futura Medium"/>
+        </w:rPr>
+        <w:t>this was because excised macroalgal tissue can continue to photosynthesise for months</w:t>
+      </w:r>
+      <w:r>
+        <w:rPr>
+          <w:rFonts w:ascii="Futura Medium" w:hAnsi="Futura Medium" w:cs="Futura Medium"/>
+        </w:rPr>
+        <w:t xml:space="preserve"> </w:t>
+      </w:r>
+      <w:r>
+        <w:rPr>
+          <w:rFonts w:ascii="Futura Medium" w:hAnsi="Futura Medium" w:cs="Futura Medium" w:hint="cs"/>
+          <w:b/>
+          <w:bCs/>
+        </w:rPr>
+        <w:t xml:space="preserve">{de </w:t>
+      </w:r>
+      <w:proofErr w:type="spellStart"/>
+      <w:r>
+        <w:rPr>
+          <w:rFonts w:ascii="Futura Medium" w:hAnsi="Futura Medium" w:cs="Futura Medium" w:hint="cs"/>
+          <w:b/>
+          <w:bCs/>
+        </w:rPr>
+        <w:t>Bettignies</w:t>
+      </w:r>
+      <w:proofErr w:type="spellEnd"/>
+      <w:r>
+        <w:rPr>
+          <w:rFonts w:ascii="Futura Medium" w:hAnsi="Futura Medium" w:cs="Futura Medium" w:hint="cs"/>
+          <w:b/>
+          <w:bCs/>
+        </w:rPr>
+        <w:t xml:space="preserve"> et al., 2020, #</w:t>
+      </w:r>
+      <w:proofErr w:type="gramStart"/>
+      <w:r>
+        <w:rPr>
+          <w:rFonts w:ascii="Futura Medium" w:hAnsi="Futura Medium" w:cs="Futura Medium" w:hint="cs"/>
+          <w:b/>
+          <w:bCs/>
+        </w:rPr>
+        <w:t>27484}</w:t>
+      </w:r>
+      <w:r>
+        <w:rPr>
+          <w:rFonts w:ascii="Futura Medium" w:hAnsi="Futura Medium" w:cs="Futura Medium" w:hint="cs"/>
+          <w:b/>
+          <w:bCs/>
+        </w:rPr>
+        <w:t>{</w:t>
+      </w:r>
+      <w:proofErr w:type="gramEnd"/>
+      <w:r>
+        <w:rPr>
+          <w:rFonts w:ascii="Futura Medium" w:hAnsi="Futura Medium" w:cs="Futura Medium" w:hint="cs"/>
+          <w:b/>
+          <w:bCs/>
+        </w:rPr>
+        <w:t>Frontier et al., 2021, #</w:t>
+      </w:r>
+      <w:proofErr w:type="gramStart"/>
+      <w:r>
+        <w:rPr>
+          <w:rFonts w:ascii="Futura Medium" w:hAnsi="Futura Medium" w:cs="Futura Medium" w:hint="cs"/>
+          <w:b/>
+          <w:bCs/>
+        </w:rPr>
+        <w:t>5573}</w:t>
+      </w:r>
+      <w:r>
+        <w:rPr>
+          <w:rFonts w:ascii="Futura Medium" w:hAnsi="Futura Medium" w:cs="Futura Medium" w:hint="cs"/>
+          <w:b/>
+          <w:bCs/>
+        </w:rPr>
+        <w:t>{</w:t>
+      </w:r>
+      <w:proofErr w:type="gramEnd"/>
+      <w:r>
+        <w:rPr>
+          <w:rFonts w:ascii="Futura Medium" w:hAnsi="Futura Medium" w:cs="Futura Medium" w:hint="cs"/>
+          <w:b/>
+          <w:bCs/>
+        </w:rPr>
+        <w:t>Frontier et al., 2021, #</w:t>
+      </w:r>
+      <w:proofErr w:type="gramStart"/>
+      <w:r>
+        <w:rPr>
+          <w:rFonts w:ascii="Futura Medium" w:hAnsi="Futura Medium" w:cs="Futura Medium" w:hint="cs"/>
+          <w:b/>
+          <w:bCs/>
+        </w:rPr>
+        <w:t>81382}</w:t>
+      </w:r>
+      <w:r>
+        <w:rPr>
+          <w:rFonts w:ascii="Futura Medium" w:hAnsi="Futura Medium" w:cs="Futura Medium"/>
+        </w:rPr>
+        <w:t>{</w:t>
+      </w:r>
+      <w:proofErr w:type="gramEnd"/>
+      <w:r>
+        <w:rPr>
+          <w:rFonts w:ascii="Futura Medium" w:hAnsi="Futura Medium" w:cs="Futura Medium"/>
+        </w:rPr>
+        <w:t>Wright et al., 2022, #84779}</w:t>
+      </w:r>
+      <w:r>
+        <w:rPr>
+          <w:rFonts w:ascii="Futura Medium" w:hAnsi="Futura Medium" w:cs="Futura Medium"/>
+        </w:rPr>
+        <w:t>.</w:t>
+      </w:r>
+      <w:r>
+        <w:rPr>
+          <w:rFonts w:ascii="Futura Medium" w:hAnsi="Futura Medium" w:cs="Futura Medium"/>
+        </w:rPr>
+        <w:t xml:space="preserve"> There is now extensive investigation into what</w:t>
+      </w:r>
+      <w:r>
+        <w:rPr>
+          <w:rFonts w:ascii="Futura Medium" w:hAnsi="Futura Medium" w:cs="Futura Medium"/>
+        </w:rPr>
+        <w:t xml:space="preserve"> has </w:t>
+      </w:r>
+      <w:r>
+        <w:rPr>
+          <w:rFonts w:ascii="Futura Medium" w:hAnsi="Futura Medium" w:cs="Futura Medium"/>
+        </w:rPr>
+        <w:t xml:space="preserve">since </w:t>
+      </w:r>
+      <w:r>
+        <w:rPr>
+          <w:rFonts w:ascii="Futura Medium" w:hAnsi="Futura Medium" w:cs="Futura Medium"/>
+        </w:rPr>
+        <w:t>been termed detrital photosynthesis</w:t>
+      </w:r>
+      <w:r>
+        <w:rPr>
+          <w:rFonts w:ascii="Futura Medium" w:hAnsi="Futura Medium" w:cs="Futura Medium"/>
+        </w:rPr>
+        <w:t xml:space="preserve"> </w:t>
+      </w:r>
+      <w:r>
+        <w:rPr>
+          <w:rFonts w:ascii="Futura Medium" w:hAnsi="Futura Medium" w:cs="Futura Medium" w:hint="cs"/>
+          <w:b/>
+          <w:bCs/>
+        </w:rPr>
+        <w:t xml:space="preserve">{Wright et al., 2023, #11375}{Wright and Foggo, 2021, #58012}{Wright and </w:t>
+      </w:r>
+      <w:proofErr w:type="spellStart"/>
+      <w:r>
+        <w:rPr>
+          <w:rFonts w:ascii="Futura Medium" w:hAnsi="Futura Medium" w:cs="Futura Medium" w:hint="cs"/>
+          <w:b/>
+          <w:bCs/>
+        </w:rPr>
+        <w:t>Kregting</w:t>
+      </w:r>
+      <w:proofErr w:type="spellEnd"/>
+      <w:r>
+        <w:rPr>
+          <w:rFonts w:ascii="Futura Medium" w:hAnsi="Futura Medium" w:cs="Futura Medium" w:hint="cs"/>
+          <w:b/>
+          <w:bCs/>
+        </w:rPr>
+        <w:t>, 2023, #49344}</w:t>
+      </w:r>
+      <w:r>
+        <w:rPr>
+          <w:rFonts w:ascii="Futura Medium" w:hAnsi="Futura Medium" w:cs="Futura Medium"/>
+        </w:rPr>
+        <w:t xml:space="preserve"> and m</w:t>
+      </w:r>
+      <w:r>
+        <w:rPr>
+          <w:rFonts w:ascii="Futura Medium" w:hAnsi="Futura Medium" w:cs="Futura Medium"/>
+        </w:rPr>
+        <w:t xml:space="preserve">acroalgae </w:t>
+      </w:r>
+      <w:r>
+        <w:rPr>
+          <w:rFonts w:ascii="Futura Medium" w:hAnsi="Futura Medium" w:cs="Futura Medium"/>
+        </w:rPr>
+        <w:t xml:space="preserve">have been found to be </w:t>
+      </w:r>
+      <w:r>
+        <w:rPr>
+          <w:rFonts w:ascii="Futura Medium" w:hAnsi="Futura Medium" w:cs="Futura Medium"/>
+        </w:rPr>
+        <w:t xml:space="preserve">unique among plants in producing detritus that exhibits photosynthesis </w:t>
+      </w:r>
+      <w:r>
+        <w:rPr>
+          <w:rFonts w:ascii="Futura Medium" w:hAnsi="Futura Medium" w:cs="Futura Medium"/>
+        </w:rPr>
+        <w:t>to an extent that</w:t>
+      </w:r>
+      <w:r>
+        <w:rPr>
+          <w:rFonts w:ascii="Futura Medium" w:hAnsi="Futura Medium" w:cs="Futura Medium"/>
+        </w:rPr>
+        <w:t xml:space="preserve"> is likely to</w:t>
+      </w:r>
+      <w:r>
+        <w:rPr>
+          <w:rFonts w:ascii="Futura Medium" w:hAnsi="Futura Medium" w:cs="Futura Medium"/>
+        </w:rPr>
+        <w:t xml:space="preserve"> </w:t>
+      </w:r>
+      <w:r>
+        <w:rPr>
+          <w:rFonts w:ascii="Futura Medium" w:hAnsi="Futura Medium" w:cs="Futura Medium"/>
+        </w:rPr>
+        <w:t>influence decomposition</w:t>
+      </w:r>
+      <w:r>
+        <w:rPr>
+          <w:rFonts w:ascii="Futura Medium" w:hAnsi="Futura Medium" w:cs="Futura Medium"/>
+        </w:rPr>
+        <w:t xml:space="preserve"> (Wright, in review).</w:t>
+      </w:r>
+      <w:r>
+        <w:rPr>
+          <w:rFonts w:ascii="Futura Medium" w:hAnsi="Futura Medium" w:cs="Futura Medium"/>
+        </w:rPr>
+        <w:t xml:space="preserve"> This knowledge enables the creation of a model that accurately describes macroalgal decomposition by </w:t>
+      </w:r>
+      <w:proofErr w:type="gramStart"/>
+      <w:r>
+        <w:rPr>
+          <w:rFonts w:ascii="Futura Medium" w:hAnsi="Futura Medium" w:cs="Futura Medium"/>
+        </w:rPr>
+        <w:t>taking into account</w:t>
+      </w:r>
+      <w:proofErr w:type="gramEnd"/>
+      <w:r>
+        <w:rPr>
+          <w:rFonts w:ascii="Futura Medium" w:hAnsi="Futura Medium" w:cs="Futura Medium"/>
+        </w:rPr>
+        <w:t xml:space="preserve"> detrital photosynthesis.</w:t>
+      </w:r>
+    </w:p>
+    <w:p>
+      <w:pPr>
+        <w:rPr>
+          <w:rFonts w:ascii="Futura Medium" w:hAnsi="Futura Medium" w:cs="Futura Medium"/>
+        </w:rPr>
+      </w:pPr>
+    </w:p>
+    <w:p>
+      <w:pPr>
+        <w:rPr>
+          <w:rFonts w:ascii="Futura Medium" w:hAnsi="Futura Medium" w:cs="Futura Medium"/>
+        </w:rPr>
+      </w:pPr>
+    </w:p>
+    <w:p>
+      <w:pPr>
+        <w:rPr>
+          <w:rFonts w:ascii="Futura Medium" w:hAnsi="Futura Medium" w:cs="Futura Medium" w:hint="cs"/>
+          <w:b/>
+          <w:bCs/>
+        </w:rPr>
+      </w:pPr>
+    </w:p>
+    <w:p>
+      <w:pPr>
+        <w:rPr>
+          <w:rFonts w:ascii="Futura Medium" w:hAnsi="Futura Medium" w:cs="Futura Medium" w:hint="cs"/>
+          <w:b/>
+          <w:bCs/>
+        </w:rPr>
+      </w:pPr>
+      <w:r>
+        <w:rPr>
+          <w:rFonts w:ascii="Futura Medium" w:hAnsi="Futura Medium" w:cs="Futura Medium" w:hint="cs"/>
+          <w:b/>
+          <w:bCs/>
+        </w:rPr>
+        <w:t>{Rovira and Rovira, 2010, #106773}</w:t>
+      </w:r>
+    </w:p>
+    <w:p>
+      <w:pPr>
+        <w:rPr>
+          <w:rFonts w:ascii="Futura Medium" w:hAnsi="Futura Medium" w:cs="Futura Medium" w:hint="cs"/>
+          <w:b/>
+          <w:bCs/>
+        </w:rPr>
+      </w:pPr>
+    </w:p>
+    <w:p>
+      <w:pPr>
+        <w:rPr>
+          <w:rFonts w:ascii="Futura Medium" w:hAnsi="Futura Medium" w:cs="Futura Medium" w:hint="cs"/>
+          <w:b/>
+          <w:bCs/>
+        </w:rPr>
+      </w:pPr>
+      <w:r>
+        <w:rPr>
+          <w:rFonts w:ascii="Futura Medium" w:hAnsi="Futura Medium" w:cs="Futura Medium" w:hint="cs"/>
+          <w:b/>
+          <w:bCs/>
+        </w:rPr>
+        <w:t>{Trevathan-Tackett et al., 2020, #39238}</w:t>
+      </w:r>
+    </w:p>
+    <w:p>
+      <w:pPr>
+        <w:rPr>
+          <w:rFonts w:ascii="Futura Medium" w:hAnsi="Futura Medium" w:cs="Futura Medium" w:hint="cs"/>
+          <w:b/>
+          <w:bCs/>
+        </w:rPr>
+      </w:pPr>
+    </w:p>
+    <w:p>
+      <w:pPr>
+        <w:rPr>
+          <w:rFonts w:ascii="Futura Medium" w:hAnsi="Futura Medium" w:cs="Futura Medium" w:hint="cs"/>
+          <w:b/>
+          <w:bCs/>
+        </w:rPr>
+      </w:pPr>
+      <w:r>
+        <w:rPr>
+          <w:rFonts w:ascii="Futura Medium" w:hAnsi="Futura Medium" w:cs="Futura Medium" w:hint="cs"/>
+          <w:b/>
+          <w:bCs/>
+        </w:rPr>
+        <w:t>The mathematical model</w:t>
+      </w:r>
+    </w:p>
+    <w:p>
+      <w:pPr>
+        <w:rPr>
+          <w:rFonts w:ascii="Futura Medium" w:hAnsi="Futura Medium" w:cs="Futura Medium"/>
+          <w:b/>
+          <w:bCs/>
+        </w:rPr>
+      </w:pPr>
+    </w:p>
+    <w:p>
+      <w:pPr>
+        <w:rPr>
+          <w:rFonts w:ascii="Futura Medium" w:hAnsi="Futura Medium" w:cs="Futura Medium"/>
+          <w:b/>
+          <w:bCs/>
+        </w:rPr>
+      </w:pPr>
+      <w:r>
+        <w:rPr>
+          <w:rFonts w:ascii="Futura Medium" w:hAnsi="Futura Medium" w:cs="Futura Medium"/>
+          <w:b/>
+          <w:bCs/>
+        </w:rPr>
+        <w:t>Examples</w:t>
+      </w:r>
+    </w:p>
+    <w:p>
+      <w:pPr>
+        <w:rPr>
+          <w:rFonts w:ascii="Futura Medium" w:hAnsi="Futura Medium" w:cs="Futura Medium" w:hint="cs"/>
+          <w:b/>
+          <w:bCs/>
+        </w:rPr>
+      </w:pPr>
+    </w:p>
+    <w:p>
+      <w:pPr>
+        <w:rPr>
+          <w:rFonts w:ascii="Futura Medium" w:hAnsi="Futura Medium" w:cs="Futura Medium" w:hint="cs"/>
+          <w:b/>
+          <w:bCs/>
+        </w:rPr>
+      </w:pPr>
+      <w:r>
+        <w:rPr>
+          <w:rFonts w:ascii="Futura Medium" w:hAnsi="Futura Medium" w:cs="Futura Medium" w:hint="cs"/>
+          <w:b/>
+          <w:bCs/>
+        </w:rPr>
+        <w:t>Implementation in R</w:t>
+      </w:r>
+      <w:r>
+        <w:rPr>
+          <w:rFonts w:ascii="Futura Medium" w:hAnsi="Futura Medium" w:cs="Futura Medium" w:hint="cs"/>
+          <w:b/>
+          <w:bCs/>
+        </w:rPr>
+        <w:t xml:space="preserve"> and Stan</w:t>
+      </w:r>
+    </w:p>
+    <w:p>
+      <w:pPr>
+        <w:rPr>
+          <w:rFonts w:ascii="Futura Medium" w:hAnsi="Futura Medium" w:cs="Futura Medium" w:hint="cs"/>
+          <w:b/>
+          <w:bCs/>
+        </w:rPr>
+      </w:pPr>
+    </w:p>
+    <w:p>
+      <w:pPr>
+        <w:rPr>
+          <w:rFonts w:ascii="Futura Medium" w:hAnsi="Futura Medium" w:cs="Futura Medium" w:hint="cs"/>
+          <w:b/>
+          <w:bCs/>
+        </w:rPr>
+      </w:pPr>
+      <w:r>
+        <w:rPr>
+          <w:rFonts w:ascii="Futura Medium" w:hAnsi="Futura Medium" w:cs="Futura Medium"/>
+          <w:b/>
+          <w:bCs/>
+        </w:rPr>
+        <w:t>Conclusion</w:t>
       </w:r>
     </w:p>
     <w:sectPr>
@@ -668,7 +3302,7 @@
 </file>
 
 <file path=word/styles.xml><?xml version="1.0" encoding="utf-8"?>
-<w:styles xmlns:mc="http://schemas.openxmlformats.org/markup-compatibility/2006" xmlns:r="http://schemas.openxmlformats.org/officeDocument/2006/relationships" xmlns:w="http://schemas.openxmlformats.org/wordprocessingml/2006/main" xmlns:w14="http://schemas.microsoft.com/office/word/2010/wordml" xmlns:w15="http://schemas.microsoft.com/office/word/2012/wordml" xmlns:w16cex="http://schemas.microsoft.com/office/word/2018/wordml/cex" xmlns:w16cid="http://schemas.microsoft.com/office/word/2016/wordml/cid" xmlns:w16="http://schemas.microsoft.com/office/word/2018/wordml" xmlns:w16du="http://schemas.microsoft.com/office/word/2023/wordml/word16du" xmlns:w16sdtdh="http://schemas.microsoft.com/office/word/2020/wordml/sdtdatahash" xmlns:w16se="http://schemas.microsoft.com/office/word/2015/wordml/symex" mc:Ignorable="w14 w15 w16se w16cid w16 w16cex w16sdtdh w16du">
+<w:styles xmlns:mc="http://schemas.openxmlformats.org/markup-compatibility/2006" xmlns:r="http://schemas.openxmlformats.org/officeDocument/2006/relationships" xmlns:w="http://schemas.openxmlformats.org/wordprocessingml/2006/main" xmlns:w14="http://schemas.microsoft.com/office/word/2010/wordml" xmlns:w15="http://schemas.microsoft.com/office/word/2012/wordml" xmlns:w16cex="http://schemas.microsoft.com/office/word/2018/wordml/cex" xmlns:w16cid="http://schemas.microsoft.com/office/word/2016/wordml/cid" xmlns:w16="http://schemas.microsoft.com/office/word/2018/wordml" xmlns:w16du="http://schemas.microsoft.com/office/word/2023/wordml/word16du" xmlns:w16sdtdh="http://schemas.microsoft.com/office/word/2020/wordml/sdtdatahash" xmlns:w16sdtfl="http://schemas.microsoft.com/office/word/2024/wordml/sdtformatlock" xmlns:w16se="http://schemas.microsoft.com/office/word/2015/wordml/symex" mc:Ignorable="w14 w15 w16se w16cid w16 w16cex w16sdtdh w16sdtfl w16du">
   <w:docDefaults>
     <w:rPrDefault>
       <w:rPr>
@@ -1062,6 +3696,7 @@
   <w:style w:type="paragraph" w:default="1" w:styleId="Normal">
     <w:name w:val="Normal"/>
     <w:qFormat/>
+    <w:rsid w:val="00957287"/>
   </w:style>
   <w:style w:type="paragraph" w:styleId="Heading1">
     <w:name w:val="heading 1"/>
@@ -1578,6 +4213,16 @@
       <w:spacing w:val="5"/>
     </w:rPr>
   </w:style>
+  <w:style w:type="character" w:styleId="PlaceholderText">
+    <w:name w:val="Placeholder Text"/>
+    <w:basedOn w:val="DefaultParagraphFont"/>
+    <w:uiPriority w:val="99"/>
+    <w:semiHidden/>
+    <w:rsid w:val="00C24083"/>
+    <w:rPr>
+      <w:color w:val="666666"/>
+    </w:rPr>
+  </w:style>
 </w:styles>
 </file>
 

</xml_diff>